<commit_message>
update odobrate projekty ziacka knizka a cv
</commit_message>
<xml_diff>
--- a/assets/docs/CV_Martin_Hutka_EN_WEB_V2.docx
+++ b/assets/docs/CV_Martin_Hutka_EN_WEB_V2.docx
@@ -1169,6 +1169,93 @@
           <w:sz w:val="20"/>
           <w:szCs w:val="20"/>
         </w:rPr>
+        <w:t xml:space="preserve">Investment calculator</w:t>
+      </w:r>
+      <w:r>
+        <w:rPr>
+          <w:color w:val="595959"/>
+          <w:sz w:val="18"/>
+          <w:szCs w:val="18"/>
+        </w:rPr>
+        <w:t xml:space="preserve">   |   published</w:t>
+      </w:r>
+      <w:r/>
+    </w:p>
+    <w:p>
+      <w:pPr>
+        <w:pBdr/>
+        <w:spacing w:after="40"/>
+        <w:ind/>
+        <w:rPr/>
+      </w:pPr>
+      <w:r>
+        <w:rPr>
+          <w:i/>
+          <w:iCs/>
+          <w:color w:val="595959"/>
+          <w:sz w:val="18"/>
+          <w:szCs w:val="18"/>
+        </w:rPr>
+        <w:t xml:space="preserve">HTML, CSS, JavaScript, GitHub Pages</w:t>
+      </w:r>
+      <w:r/>
+    </w:p>
+    <w:p>
+      <w:pPr>
+        <w:pStyle w:val="713"/>
+        <w:numPr>
+          <w:ilvl w:val="0"/>
+          <w:numId w:val="1"/>
+        </w:numPr>
+        <w:pBdr/>
+        <w:spacing w:after="20"/>
+        <w:ind/>
+        <w:rPr/>
+      </w:pPr>
+      <w:r>
+        <w:rPr>
+          <w:sz w:val="18"/>
+          <w:szCs w:val="18"/>
+        </w:rPr>
+        <w:t xml:space="preserve">compound interest calculation with inflation, risk profiles and ETF recommendations</w:t>
+      </w:r>
+      <w:r/>
+    </w:p>
+    <w:p>
+      <w:pPr>
+        <w:pStyle w:val="713"/>
+        <w:numPr>
+          <w:ilvl w:val="0"/>
+          <w:numId w:val="1"/>
+        </w:numPr>
+        <w:pBdr/>
+        <w:spacing w:after="20"/>
+        <w:ind/>
+        <w:rPr/>
+      </w:pPr>
+      <w:r>
+        <w:rPr>
+          <w:sz w:val="18"/>
+          <w:szCs w:val="18"/>
+        </w:rPr>
+        <w:t xml:space="preserve">broker comparison, available in 5 languages (SK, CZ, EN, HU, PL)</w:t>
+      </w:r>
+      <w:r/>
+    </w:p>
+    <w:p>
+      <w:pPr>
+        <w:pBdr/>
+        <w:spacing w:after="0" w:before="100"/>
+        <w:ind/>
+        <w:rPr/>
+      </w:pPr>
+      <w:r>
+        <w:rPr>
+          <w:b/>
+          <w:bCs/>
+          <w:sz w:val="20"/>
+          <w:szCs w:val="20"/>
+        </w:rPr>
         <w:t xml:space="preserve">Booking system for commercial services</w:t>
       </w:r>
       <w:r>
@@ -1260,222 +1347,6 @@
           <w:szCs w:val="18"/>
         </w:rPr>
         <w:t xml:space="preserve">activation and deactivation of services, user and administrator interfaces</w:t>
-      </w:r>
-      <w:r/>
-    </w:p>
-    <w:p>
-      <w:pPr>
-        <w:pBdr/>
-        <w:spacing w:after="0" w:before="100"/>
-        <w:ind/>
-        <w:rPr/>
-      </w:pPr>
-      <w:r>
-        <w:rPr>
-          <w:b/>
-          <w:bCs/>
-          <w:sz w:val="20"/>
-          <w:szCs w:val="20"/>
-        </w:rPr>
-        <w:t xml:space="preserve">Student grade book — web application</w:t>
-      </w:r>
-      <w:r>
-        <w:rPr>
-          <w:color w:val="595959"/>
-          <w:sz w:val="18"/>
-          <w:szCs w:val="18"/>
-        </w:rPr>
-        <w:t xml:space="preserve">   |   working demo</w:t>
-      </w:r>
-      <w:r/>
-    </w:p>
-    <w:p>
-      <w:pPr>
-        <w:pBdr/>
-        <w:spacing w:after="40"/>
-        <w:ind/>
-        <w:rPr/>
-      </w:pPr>
-      <w:r>
-        <w:rPr>
-          <w:i/>
-          <w:iCs/>
-          <w:color w:val="595959"/>
-          <w:sz w:val="18"/>
-          <w:szCs w:val="18"/>
-        </w:rPr>
-        <w:t xml:space="preserve">Node.js, Express, MySQL, Docker</w:t>
-      </w:r>
-      <w:r/>
-    </w:p>
-    <w:p>
-      <w:pPr>
-        <w:pStyle w:val="713"/>
-        <w:numPr>
-          <w:ilvl w:val="0"/>
-          <w:numId w:val="1"/>
-        </w:numPr>
-        <w:pBdr/>
-        <w:spacing w:after="20"/>
-        <w:ind/>
-        <w:rPr/>
-      </w:pPr>
-      <w:r>
-        <w:rPr>
-          <w:sz w:val="18"/>
-          <w:szCs w:val="18"/>
-        </w:rPr>
-        <w:t xml:space="preserve">multi-role application (admin, teacher, student)</w:t>
-      </w:r>
-      <w:r/>
-    </w:p>
-    <w:p>
-      <w:pPr>
-        <w:pStyle w:val="713"/>
-        <w:numPr>
-          <w:ilvl w:val="0"/>
-          <w:numId w:val="1"/>
-        </w:numPr>
-        <w:pBdr/>
-        <w:spacing w:after="20"/>
-        <w:ind/>
-        <w:rPr/>
-      </w:pPr>
-      <w:r>
-        <w:rPr>
-          <w:sz w:val="18"/>
-          <w:szCs w:val="18"/>
-        </w:rPr>
-        <w:t xml:space="preserve">management of users, classes, subjects and grades</w:t>
-      </w:r>
-      <w:r/>
-    </w:p>
-    <w:p>
-      <w:pPr>
-        <w:pStyle w:val="713"/>
-        <w:numPr>
-          <w:ilvl w:val="0"/>
-          <w:numId w:val="1"/>
-        </w:numPr>
-        <w:pBdr/>
-        <w:spacing w:after="20"/>
-        <w:ind/>
-        <w:rPr/>
-      </w:pPr>
-      <w:r>
-        <w:rPr>
-          <w:sz w:val="18"/>
-          <w:szCs w:val="18"/>
-        </w:rPr>
-        <w:t xml:space="preserve">REST API, database design (MySQL/MariaDB), Docker environment</w:t>
-      </w:r>
-      <w:r/>
-    </w:p>
-    <w:p>
-      <w:pPr>
-        <w:pStyle w:val="713"/>
-        <w:numPr>
-          <w:ilvl w:val="0"/>
-          <w:numId w:val="1"/>
-        </w:numPr>
-        <w:pBdr/>
-        <w:spacing w:after="20"/>
-        <w:ind/>
-        <w:rPr/>
-      </w:pPr>
-      <w:r>
-        <w:rPr>
-          <w:sz w:val="18"/>
-          <w:szCs w:val="18"/>
-        </w:rPr>
-        <w:t xml:space="preserve">created as a semester team project and actively developed further</w:t>
-      </w:r>
-      <w:r/>
-    </w:p>
-    <w:p>
-      <w:pPr>
-        <w:pBdr/>
-        <w:spacing w:after="0" w:before="100"/>
-        <w:ind/>
-        <w:rPr/>
-      </w:pPr>
-      <w:r>
-        <w:rPr>
-          <w:b/>
-          <w:bCs/>
-          <w:sz w:val="20"/>
-          <w:szCs w:val="20"/>
-        </w:rPr>
-        <w:t xml:space="preserve">Investment calculator</w:t>
-      </w:r>
-      <w:r>
-        <w:rPr>
-          <w:color w:val="595959"/>
-          <w:sz w:val="18"/>
-          <w:szCs w:val="18"/>
-        </w:rPr>
-        <w:t xml:space="preserve">   |   published</w:t>
-      </w:r>
-      <w:r/>
-    </w:p>
-    <w:p>
-      <w:pPr>
-        <w:pBdr/>
-        <w:spacing w:after="40"/>
-        <w:ind/>
-        <w:rPr/>
-      </w:pPr>
-      <w:r>
-        <w:rPr>
-          <w:i/>
-          <w:iCs/>
-          <w:color w:val="595959"/>
-          <w:sz w:val="18"/>
-          <w:szCs w:val="18"/>
-        </w:rPr>
-        <w:t xml:space="preserve">HTML, CSS, JavaScript, GitHub Pages</w:t>
-      </w:r>
-      <w:r/>
-    </w:p>
-    <w:p>
-      <w:pPr>
-        <w:pStyle w:val="713"/>
-        <w:numPr>
-          <w:ilvl w:val="0"/>
-          <w:numId w:val="1"/>
-        </w:numPr>
-        <w:pBdr/>
-        <w:spacing w:after="20"/>
-        <w:ind/>
-        <w:rPr/>
-      </w:pPr>
-      <w:r>
-        <w:rPr>
-          <w:sz w:val="18"/>
-          <w:szCs w:val="18"/>
-        </w:rPr>
-        <w:t xml:space="preserve">compound interest calculation with inflation, risk profiles and ETF recommendations</w:t>
-      </w:r>
-      <w:r/>
-    </w:p>
-    <w:p>
-      <w:pPr>
-        <w:pStyle w:val="713"/>
-        <w:numPr>
-          <w:ilvl w:val="0"/>
-          <w:numId w:val="1"/>
-        </w:numPr>
-        <w:pBdr/>
-        <w:spacing w:after="20"/>
-        <w:ind/>
-        <w:rPr/>
-      </w:pPr>
-      <w:r>
-        <w:rPr>
-          <w:sz w:val="18"/>
-          <w:szCs w:val="18"/>
-        </w:rPr>
-        <w:t xml:space="preserve">broker comparison, available in 5 languages (SK, CZ, EN, HU, PL)</w:t>
       </w:r>
       <w:r/>
     </w:p>

</xml_diff>

<commit_message>
zmena CV pdf s novou adresou
</commit_message>
<xml_diff>
--- a/assets/docs/CV_Martin_Hutka_EN_WEB_V2.docx
+++ b/assets/docs/CV_Martin_Hutka_EN_WEB_V2.docx
@@ -4,7 +4,6 @@
   <w:body>
     <w:p>
       <w:pPr>
-        <w:pBdr/>
         <w:spacing w:after="0"/>
         <w:ind/>
         <w:rPr/>
@@ -23,7 +22,6 @@
     </w:p>
     <w:p>
       <w:pPr>
-        <w:pBdr/>
         <w:spacing w:after="80"/>
         <w:ind/>
         <w:rPr/>
@@ -40,7 +38,6 @@
     </w:p>
     <w:p>
       <w:pPr>
-        <w:pBdr/>
         <w:spacing w:after="20"/>
         <w:ind/>
         <w:rPr/>
@@ -56,7 +53,6 @@
     </w:p>
     <w:p>
       <w:pPr>
-        <w:pBdr/>
         <w:spacing w:after="40"/>
         <w:ind/>
         <w:rPr/>
@@ -104,23 +100,26 @@
         </w:rPr>
         <w:t xml:space="preserve">   ·   Online CV and projects: </w:t>
       </w:r>
-      <w:hyperlink r:id="rId11" w:tooltip="https://m4h44.github.io/cv-site/en/index.html" w:history="1">
+      <w:hyperlink r:id="rId11" w:tooltip="https://martinhutka.is-a.dev/en/" w:history="1">
         <w:r>
           <w:rPr>
-            <w:color w:val="1f4e79"/>
+            <w:rStyle w:val="886"/>
             <w:sz w:val="18"/>
             <w:szCs w:val="18"/>
-            <w:u w:val="single"/>
           </w:rPr>
-          <w:t xml:space="preserve">m4h44.github.io/cv-site/en</w:t>
+          <w:t xml:space="preserve">martinhutka.is-a.dev/en/</w:t>
         </w:r>
       </w:hyperlink>
-      <w:r/>
+      <w:r>
+        <w:rPr>
+          <w:sz w:val="18"/>
+          <w:szCs w:val="18"/>
+        </w:rPr>
+      </w:r>
       <w:r/>
     </w:p>
     <w:p>
       <w:pPr>
-        <w:pBdr/>
         <w:spacing w:after="20" w:before="200"/>
         <w:ind/>
         <w:rPr/>
@@ -157,7 +156,6 @@
     </w:p>
     <w:p>
       <w:pPr>
-        <w:pBdr/>
         <w:spacing w:after="40"/>
         <w:ind/>
         <w:jc w:val="both"/>
@@ -195,7 +193,6 @@
     </w:p>
     <w:p>
       <w:pPr>
-        <w:pBdr/>
         <w:spacing w:after="20" w:before="200"/>
         <w:ind/>
         <w:rPr/>
@@ -232,7 +229,6 @@
     </w:p>
     <w:p>
       <w:pPr>
-        <w:pBdr/>
         <w:spacing w:after="40"/>
         <w:ind/>
         <w:rPr/>
@@ -257,7 +253,6 @@
     </w:p>
     <w:p>
       <w:pPr>
-        <w:pBdr/>
         <w:spacing w:after="40"/>
         <w:ind/>
         <w:rPr/>
@@ -282,7 +277,6 @@
     </w:p>
     <w:p>
       <w:pPr>
-        <w:pBdr/>
         <w:spacing w:after="40"/>
         <w:ind/>
         <w:rPr/>
@@ -307,7 +301,6 @@
     </w:p>
     <w:p>
       <w:pPr>
-        <w:pBdr/>
         <w:spacing w:after="40"/>
         <w:ind/>
         <w:rPr/>
@@ -332,7 +325,6 @@
     </w:p>
     <w:p>
       <w:pPr>
-        <w:pBdr/>
         <w:spacing w:after="40"/>
         <w:ind/>
         <w:rPr/>
@@ -357,7 +349,6 @@
     </w:p>
     <w:p>
       <w:pPr>
-        <w:pBdr/>
         <w:spacing w:after="40"/>
         <w:ind/>
         <w:rPr/>
@@ -382,7 +373,6 @@
     </w:p>
     <w:p>
       <w:pPr>
-        <w:pBdr/>
         <w:spacing w:after="20" w:before="200"/>
         <w:ind/>
         <w:rPr/>
@@ -419,7 +409,6 @@
     </w:p>
     <w:p>
       <w:pPr>
-        <w:pBdr/>
         <w:spacing w:after="0" w:before="100"/>
         <w:ind/>
         <w:rPr/>
@@ -445,7 +434,6 @@
     </w:p>
     <w:p>
       <w:pPr>
-        <w:pBdr/>
         <w:spacing w:after="40"/>
         <w:ind/>
         <w:rPr/>
@@ -464,12 +452,11 @@
     </w:p>
     <w:p>
       <w:pPr>
-        <w:pStyle w:val="713"/>
+        <w:pStyle w:val="885"/>
         <w:numPr>
           <w:ilvl w:val="0"/>
           <w:numId w:val="1"/>
         </w:numPr>
-        <w:pBdr/>
         <w:spacing w:after="20"/>
         <w:ind/>
         <w:rPr/>
@@ -485,12 +472,11 @@
     </w:p>
     <w:p>
       <w:pPr>
-        <w:pStyle w:val="713"/>
+        <w:pStyle w:val="885"/>
         <w:numPr>
           <w:ilvl w:val="0"/>
           <w:numId w:val="1"/>
         </w:numPr>
-        <w:pBdr/>
         <w:spacing w:after="20"/>
         <w:ind/>
         <w:rPr/>
@@ -506,12 +492,11 @@
     </w:p>
     <w:p>
       <w:pPr>
-        <w:pStyle w:val="713"/>
+        <w:pStyle w:val="885"/>
         <w:numPr>
           <w:ilvl w:val="0"/>
           <w:numId w:val="1"/>
         </w:numPr>
-        <w:pBdr/>
         <w:spacing w:after="20"/>
         <w:ind/>
         <w:rPr/>
@@ -527,12 +512,11 @@
     </w:p>
     <w:p>
       <w:pPr>
-        <w:pStyle w:val="713"/>
+        <w:pStyle w:val="885"/>
         <w:numPr>
           <w:ilvl w:val="0"/>
           <w:numId w:val="1"/>
         </w:numPr>
-        <w:pBdr/>
         <w:spacing w:after="20"/>
         <w:ind/>
         <w:rPr/>
@@ -548,12 +532,11 @@
     </w:p>
     <w:p>
       <w:pPr>
-        <w:pStyle w:val="713"/>
+        <w:pStyle w:val="885"/>
         <w:numPr>
           <w:ilvl w:val="0"/>
           <w:numId w:val="1"/>
         </w:numPr>
-        <w:pBdr/>
         <w:spacing w:after="20"/>
         <w:ind/>
         <w:rPr/>
@@ -569,12 +552,11 @@
     </w:p>
     <w:p>
       <w:pPr>
-        <w:pStyle w:val="713"/>
+        <w:pStyle w:val="885"/>
         <w:numPr>
           <w:ilvl w:val="0"/>
           <w:numId w:val="1"/>
         </w:numPr>
-        <w:pBdr/>
         <w:spacing w:after="20"/>
         <w:ind/>
         <w:rPr/>
@@ -590,12 +572,11 @@
     </w:p>
     <w:p>
       <w:pPr>
-        <w:pStyle w:val="713"/>
+        <w:pStyle w:val="885"/>
         <w:numPr>
           <w:ilvl w:val="0"/>
           <w:numId w:val="1"/>
         </w:numPr>
-        <w:pBdr/>
         <w:spacing w:after="20"/>
         <w:ind/>
         <w:rPr/>
@@ -611,12 +592,11 @@
     </w:p>
     <w:p>
       <w:pPr>
-        <w:pStyle w:val="713"/>
+        <w:pStyle w:val="885"/>
         <w:numPr>
           <w:ilvl w:val="0"/>
           <w:numId w:val="1"/>
         </w:numPr>
-        <w:pBdr/>
         <w:spacing w:after="20"/>
         <w:ind/>
         <w:rPr/>
@@ -632,12 +612,11 @@
     </w:p>
     <w:p>
       <w:pPr>
-        <w:pStyle w:val="713"/>
+        <w:pStyle w:val="885"/>
         <w:numPr>
           <w:ilvl w:val="0"/>
           <w:numId w:val="1"/>
         </w:numPr>
-        <w:pBdr/>
         <w:spacing w:after="20"/>
         <w:ind/>
         <w:rPr/>
@@ -653,12 +632,11 @@
     </w:p>
     <w:p>
       <w:pPr>
-        <w:pStyle w:val="713"/>
+        <w:pStyle w:val="885"/>
         <w:numPr>
           <w:ilvl w:val="0"/>
           <w:numId w:val="1"/>
         </w:numPr>
-        <w:pBdr/>
         <w:spacing w:after="20"/>
         <w:ind/>
         <w:rPr/>
@@ -674,12 +652,11 @@
     </w:p>
     <w:p>
       <w:pPr>
-        <w:pStyle w:val="713"/>
+        <w:pStyle w:val="885"/>
         <w:numPr>
           <w:ilvl w:val="0"/>
           <w:numId w:val="1"/>
         </w:numPr>
-        <w:pBdr/>
         <w:spacing w:after="20"/>
         <w:ind/>
         <w:rPr/>
@@ -695,7 +672,6 @@
     </w:p>
     <w:p>
       <w:pPr>
-        <w:pBdr/>
         <w:spacing w:after="0" w:before="100"/>
         <w:ind/>
         <w:rPr/>
@@ -721,7 +697,6 @@
     </w:p>
     <w:p>
       <w:pPr>
-        <w:pBdr/>
         <w:spacing w:after="40"/>
         <w:ind/>
         <w:rPr/>
@@ -740,12 +715,11 @@
     </w:p>
     <w:p>
       <w:pPr>
-        <w:pStyle w:val="713"/>
+        <w:pStyle w:val="885"/>
         <w:numPr>
           <w:ilvl w:val="0"/>
           <w:numId w:val="1"/>
         </w:numPr>
-        <w:pBdr/>
         <w:spacing w:after="20"/>
         <w:ind/>
         <w:rPr/>
@@ -761,12 +735,11 @@
     </w:p>
     <w:p>
       <w:pPr>
-        <w:pStyle w:val="713"/>
+        <w:pStyle w:val="885"/>
         <w:numPr>
           <w:ilvl w:val="0"/>
           <w:numId w:val="1"/>
         </w:numPr>
-        <w:pBdr/>
         <w:spacing w:after="20"/>
         <w:ind/>
         <w:rPr/>
@@ -782,12 +755,11 @@
     </w:p>
     <w:p>
       <w:pPr>
-        <w:pStyle w:val="713"/>
+        <w:pStyle w:val="885"/>
         <w:numPr>
           <w:ilvl w:val="0"/>
           <w:numId w:val="1"/>
         </w:numPr>
-        <w:pBdr/>
         <w:spacing w:after="20"/>
         <w:ind/>
         <w:rPr/>
@@ -803,12 +775,11 @@
     </w:p>
     <w:p>
       <w:pPr>
-        <w:pStyle w:val="713"/>
+        <w:pStyle w:val="885"/>
         <w:numPr>
           <w:ilvl w:val="0"/>
           <w:numId w:val="1"/>
         </w:numPr>
-        <w:pBdr/>
         <w:spacing w:after="20"/>
         <w:ind/>
         <w:rPr/>
@@ -824,12 +795,11 @@
     </w:p>
     <w:p>
       <w:pPr>
-        <w:pStyle w:val="713"/>
+        <w:pStyle w:val="885"/>
         <w:numPr>
           <w:ilvl w:val="0"/>
           <w:numId w:val="1"/>
         </w:numPr>
-        <w:pBdr/>
         <w:spacing w:after="20"/>
         <w:ind/>
         <w:rPr/>
@@ -845,10 +815,38 @@
     </w:p>
     <w:p>
       <w:pPr>
-        <w:pBdr/>
         <w:spacing w:after="0" w:before="100"/>
         <w:ind/>
         <w:rPr/>
+      </w:pPr>
+      <w:r>
+        <w:rPr>
+          <w:color w:val="595959"/>
+          <w:sz w:val="18"/>
+          <w:szCs w:val="18"/>
+          <w:highlight w:val="none"/>
+        </w:rPr>
+      </w:r>
+      <w:r>
+        <w:rPr>
+          <w:color w:val="595959"/>
+          <w:sz w:val="18"/>
+          <w:szCs w:val="18"/>
+          <w:highlight w:val="none"/>
+        </w:rPr>
+      </w:r>
+      <w:r/>
+    </w:p>
+    <w:p>
+      <w:pPr>
+        <w:spacing w:after="0" w:before="100"/>
+        <w:ind/>
+        <w:rPr>
+          <w:color w:val="595959"/>
+          <w:sz w:val="18"/>
+          <w:szCs w:val="18"/>
+          <w:highlight w:val="none"/>
+        </w:rPr>
       </w:pPr>
       <w:r>
         <w:rPr>
@@ -877,7 +875,6 @@
     </w:p>
     <w:p>
       <w:pPr>
-        <w:pBdr/>
         <w:spacing w:after="0" w:before="100"/>
         <w:ind/>
         <w:rPr>
@@ -914,7 +911,6 @@
     </w:p>
     <w:p>
       <w:pPr>
-        <w:pBdr/>
         <w:spacing w:after="0" w:before="100"/>
         <w:ind/>
         <w:rPr>
@@ -951,44 +947,6 @@
     </w:p>
     <w:p>
       <w:pPr>
-        <w:pBdr/>
-        <w:spacing w:after="0" w:before="100"/>
-        <w:ind/>
-        <w:rPr>
-          <w:color w:val="595959"/>
-          <w:sz w:val="18"/>
-          <w:szCs w:val="18"/>
-          <w:highlight w:val="none"/>
-        </w:rPr>
-      </w:pPr>
-      <w:r>
-        <w:rPr>
-          <w:color w:val="595959"/>
-          <w:sz w:val="18"/>
-          <w:szCs w:val="18"/>
-          <w:highlight w:val="none"/>
-        </w:rPr>
-      </w:r>
-      <w:r>
-        <w:rPr>
-          <w:color w:val="595959"/>
-          <w:sz w:val="18"/>
-          <w:szCs w:val="18"/>
-          <w:highlight w:val="none"/>
-        </w:rPr>
-      </w:r>
-      <w:r>
-        <w:rPr>
-          <w:color w:val="595959"/>
-          <w:sz w:val="18"/>
-          <w:szCs w:val="18"/>
-          <w:highlight w:val="none"/>
-        </w:rPr>
-      </w:r>
-    </w:p>
-    <w:p>
-      <w:pPr>
-        <w:pBdr/>
         <w:spacing w:after="0" w:before="100"/>
         <w:ind/>
         <w:rPr>
@@ -1015,11 +973,17 @@
         </w:rPr>
         <w:t xml:space="preserve">   |   1999 – present</w:t>
       </w:r>
-      <w:r/>
+      <w:r>
+        <w:rPr>
+          <w:color w:val="595959"/>
+          <w:sz w:val="18"/>
+          <w:szCs w:val="18"/>
+          <w:highlight w:val="none"/>
+        </w:rPr>
+      </w:r>
     </w:p>
     <w:p>
       <w:pPr>
-        <w:pBdr/>
         <w:spacing w:after="40"/>
         <w:ind/>
         <w:rPr/>
@@ -1038,12 +1002,11 @@
     </w:p>
     <w:p>
       <w:pPr>
-        <w:pStyle w:val="713"/>
+        <w:pStyle w:val="885"/>
         <w:numPr>
           <w:ilvl w:val="0"/>
           <w:numId w:val="1"/>
         </w:numPr>
-        <w:pBdr/>
         <w:spacing w:after="20"/>
         <w:ind/>
         <w:rPr/>
@@ -1059,12 +1022,11 @@
     </w:p>
     <w:p>
       <w:pPr>
-        <w:pStyle w:val="713"/>
+        <w:pStyle w:val="885"/>
         <w:numPr>
           <w:ilvl w:val="0"/>
           <w:numId w:val="1"/>
         </w:numPr>
-        <w:pBdr/>
         <w:spacing w:after="20"/>
         <w:ind/>
         <w:rPr/>
@@ -1080,12 +1042,11 @@
     </w:p>
     <w:p>
       <w:pPr>
-        <w:pStyle w:val="713"/>
+        <w:pStyle w:val="885"/>
         <w:numPr>
           <w:ilvl w:val="0"/>
           <w:numId w:val="1"/>
         </w:numPr>
-        <w:pBdr/>
         <w:spacing w:after="20"/>
         <w:ind/>
         <w:rPr/>
@@ -1101,7 +1062,6 @@
     </w:p>
     <w:p>
       <w:pPr>
-        <w:pBdr/>
         <w:spacing w:after="60"/>
         <w:ind/>
         <w:rPr/>
@@ -1120,7 +1080,6 @@
     </w:p>
     <w:p>
       <w:pPr>
-        <w:pBdr/>
         <w:spacing w:after="20" w:before="200"/>
         <w:ind/>
         <w:rPr/>
@@ -1157,7 +1116,6 @@
     </w:p>
     <w:p>
       <w:pPr>
-        <w:pBdr/>
         <w:spacing w:after="0" w:before="100"/>
         <w:ind/>
         <w:rPr/>
@@ -1183,7 +1141,6 @@
     </w:p>
     <w:p>
       <w:pPr>
-        <w:pBdr/>
         <w:spacing w:after="40"/>
         <w:ind/>
         <w:rPr/>
@@ -1202,12 +1159,11 @@
     </w:p>
     <w:p>
       <w:pPr>
-        <w:pStyle w:val="713"/>
+        <w:pStyle w:val="885"/>
         <w:numPr>
           <w:ilvl w:val="0"/>
           <w:numId w:val="1"/>
         </w:numPr>
-        <w:pBdr/>
         <w:spacing w:after="20"/>
         <w:ind/>
         <w:rPr/>
@@ -1223,12 +1179,11 @@
     </w:p>
     <w:p>
       <w:pPr>
-        <w:pStyle w:val="713"/>
+        <w:pStyle w:val="885"/>
         <w:numPr>
           <w:ilvl w:val="0"/>
           <w:numId w:val="1"/>
         </w:numPr>
-        <w:pBdr/>
         <w:spacing w:after="20"/>
         <w:ind/>
         <w:rPr/>
@@ -1244,7 +1199,6 @@
     </w:p>
     <w:p>
       <w:pPr>
-        <w:pBdr/>
         <w:spacing w:after="0" w:before="100"/>
         <w:ind/>
         <w:rPr/>
@@ -1270,7 +1224,6 @@
     </w:p>
     <w:p>
       <w:pPr>
-        <w:pBdr/>
         <w:spacing w:after="40"/>
         <w:ind/>
         <w:rPr/>
@@ -1289,12 +1242,11 @@
     </w:p>
     <w:p>
       <w:pPr>
-        <w:pStyle w:val="713"/>
+        <w:pStyle w:val="885"/>
         <w:numPr>
           <w:ilvl w:val="0"/>
           <w:numId w:val="1"/>
         </w:numPr>
-        <w:pBdr/>
         <w:spacing w:after="20"/>
         <w:ind/>
         <w:rPr/>
@@ -1310,12 +1262,11 @@
     </w:p>
     <w:p>
       <w:pPr>
-        <w:pStyle w:val="713"/>
+        <w:pStyle w:val="885"/>
         <w:numPr>
           <w:ilvl w:val="0"/>
           <w:numId w:val="1"/>
         </w:numPr>
-        <w:pBdr/>
         <w:spacing w:after="20"/>
         <w:ind/>
         <w:rPr/>
@@ -1331,12 +1282,11 @@
     </w:p>
     <w:p>
       <w:pPr>
-        <w:pStyle w:val="713"/>
+        <w:pStyle w:val="885"/>
         <w:numPr>
           <w:ilvl w:val="0"/>
           <w:numId w:val="1"/>
         </w:numPr>
-        <w:pBdr/>
         <w:spacing w:after="20"/>
         <w:ind/>
         <w:rPr/>
@@ -1352,7 +1302,6 @@
     </w:p>
     <w:p>
       <w:pPr>
-        <w:pBdr/>
         <w:spacing w:after="20" w:before="200"/>
         <w:ind/>
         <w:rPr/>
@@ -1389,7 +1338,6 @@
     </w:p>
     <w:p>
       <w:pPr>
-        <w:pBdr/>
         <w:spacing w:after="0" w:before="100"/>
         <w:ind/>
         <w:rPr/>
@@ -1415,7 +1363,6 @@
     </w:p>
     <w:p>
       <w:pPr>
-        <w:pBdr/>
         <w:spacing w:after="20"/>
         <w:ind/>
         <w:rPr/>
@@ -1431,7 +1378,6 @@
     </w:p>
     <w:p>
       <w:pPr>
-        <w:pBdr/>
         <w:spacing w:after="0" w:before="100"/>
         <w:ind/>
         <w:rPr/>
@@ -1457,7 +1403,6 @@
     </w:p>
     <w:p>
       <w:pPr>
-        <w:pBdr/>
         <w:spacing w:after="20"/>
         <w:ind/>
         <w:rPr/>
@@ -1473,7 +1418,6 @@
     </w:p>
     <w:p>
       <w:pPr>
-        <w:pBdr/>
         <w:spacing w:after="0" w:before="100"/>
         <w:ind/>
         <w:rPr/>
@@ -1499,7 +1443,6 @@
     </w:p>
     <w:p>
       <w:pPr>
-        <w:pBdr/>
         <w:spacing w:after="20"/>
         <w:ind/>
         <w:rPr/>
@@ -1515,7 +1458,6 @@
     </w:p>
     <w:p>
       <w:pPr>
-        <w:pBdr/>
         <w:spacing w:after="20" w:before="200"/>
         <w:ind/>
         <w:rPr/>
@@ -1552,7 +1494,6 @@
     </w:p>
     <w:p>
       <w:pPr>
-        <w:pBdr/>
         <w:spacing w:after="0" w:before="100"/>
         <w:ind/>
         <w:rPr/>
@@ -1578,7 +1519,6 @@
     </w:p>
     <w:p>
       <w:pPr>
-        <w:pBdr/>
         <w:spacing w:after="20"/>
         <w:ind/>
         <w:rPr/>
@@ -1594,7 +1534,6 @@
     </w:p>
     <w:p>
       <w:pPr>
-        <w:pBdr/>
         <w:spacing w:after="20" w:before="200"/>
         <w:ind/>
         <w:rPr/>
@@ -1631,12 +1570,11 @@
     </w:p>
     <w:p>
       <w:pPr>
-        <w:pStyle w:val="713"/>
+        <w:pStyle w:val="885"/>
         <w:numPr>
           <w:ilvl w:val="0"/>
           <w:numId w:val="1"/>
         </w:numPr>
-        <w:pBdr/>
         <w:spacing w:after="20"/>
         <w:ind/>
         <w:rPr/>
@@ -1652,12 +1590,11 @@
     </w:p>
     <w:p>
       <w:pPr>
-        <w:pStyle w:val="713"/>
+        <w:pStyle w:val="885"/>
         <w:numPr>
           <w:ilvl w:val="0"/>
           <w:numId w:val="1"/>
         </w:numPr>
-        <w:pBdr/>
         <w:spacing w:after="20"/>
         <w:ind/>
         <w:rPr/>
@@ -1673,7 +1610,6 @@
     </w:p>
     <w:p>
       <w:pPr>
-        <w:pBdr/>
         <w:spacing w:after="20" w:before="200"/>
         <w:ind/>
         <w:rPr/>
@@ -1710,12 +1646,11 @@
     </w:p>
     <w:p>
       <w:pPr>
-        <w:pStyle w:val="713"/>
+        <w:pStyle w:val="885"/>
         <w:numPr>
           <w:ilvl w:val="0"/>
           <w:numId w:val="1"/>
         </w:numPr>
-        <w:pBdr/>
         <w:spacing w:after="20"/>
         <w:ind/>
         <w:rPr/>
@@ -1731,12 +1666,11 @@
     </w:p>
     <w:p>
       <w:pPr>
-        <w:pStyle w:val="713"/>
+        <w:pStyle w:val="885"/>
         <w:numPr>
           <w:ilvl w:val="0"/>
           <w:numId w:val="1"/>
         </w:numPr>
-        <w:pBdr/>
         <w:spacing w:after="20"/>
         <w:ind/>
         <w:rPr/>
@@ -1752,12 +1686,11 @@
     </w:p>
     <w:p>
       <w:pPr>
-        <w:pStyle w:val="713"/>
+        <w:pStyle w:val="885"/>
         <w:numPr>
           <w:ilvl w:val="0"/>
           <w:numId w:val="1"/>
         </w:numPr>
-        <w:pBdr/>
         <w:spacing w:after="20"/>
         <w:ind/>
         <w:rPr/>
@@ -1788,12 +1721,10 @@
   <w:endnote w:type="separator" w:id="-1">
     <w:p>
       <w:pPr>
-        <w:pBdr/>
         <w:spacing w:after="0" w:line="240" w:lineRule="auto"/>
         <w:ind/>
         <w:rPr/>
       </w:pPr>
-      <w:r/>
       <w:r>
         <w:separator/>
       </w:r>
@@ -1803,12 +1734,10 @@
   <w:endnote w:type="continuationSeparator" w:id="0">
     <w:p>
       <w:pPr>
-        <w:pBdr/>
         <w:spacing w:after="0" w:line="240" w:lineRule="auto"/>
         <w:ind/>
         <w:rPr/>
       </w:pPr>
-      <w:r/>
       <w:r>
         <w:continuationSeparator/>
       </w:r>
@@ -1823,12 +1752,10 @@
   <w:footnote w:type="separator" w:id="-1">
     <w:p>
       <w:pPr>
-        <w:pBdr/>
         <w:spacing w:after="0" w:line="240" w:lineRule="auto"/>
         <w:ind/>
         <w:rPr/>
       </w:pPr>
-      <w:r/>
       <w:r>
         <w:separator/>
       </w:r>
@@ -1838,12 +1765,10 @@
   <w:footnote w:type="continuationSeparator" w:id="0">
     <w:p>
       <w:pPr>
-        <w:pBdr/>
         <w:spacing w:after="0" w:line="240" w:lineRule="auto"/>
         <w:ind/>
         <w:rPr/>
       </w:pPr>
-      <w:r/>
       <w:r>
         <w:continuationSeparator/>
       </w:r>
@@ -2147,7 +2072,7 @@
     <w:lsdException w:name="Bibliography" w:uiPriority="37"/>
     <w:lsdException w:name="TOC Heading" w:uiPriority="39" w:qFormat="1"/>
   </w:latentStyles>
-  <w:style w:type="table" w:styleId="11" w:default="1">
+  <w:style w:type="table" w:styleId="703" w:default="1">
     <w:name w:val="Normal Table"/>
     <w:uiPriority w:val="99"/>
     <w:semiHidden/>
@@ -2340,9 +2265,9 @@
       </w:tcPr>
     </w:tblStylePr>
   </w:style>
-  <w:style w:type="table" w:styleId="12">
+  <w:style w:type="table" w:styleId="704">
     <w:name w:val="Table Grid"/>
-    <w:basedOn w:val="11"/>
+    <w:basedOn w:val="703"/>
     <w:uiPriority w:val="59"/>
     <w:pPr>
       <w:pBdr/>
@@ -2539,9 +2464,9 @@
       </w:tcPr>
     </w:tblStylePr>
   </w:style>
-  <w:style w:type="table" w:styleId="13">
+  <w:style w:type="table" w:styleId="705">
     <w:name w:val="Table Grid Light"/>
-    <w:basedOn w:val="11"/>
+    <w:basedOn w:val="703"/>
     <w:uiPriority w:val="59"/>
     <w:pPr>
       <w:pBdr/>
@@ -2738,9 +2663,9 @@
       </w:tcPr>
     </w:tblStylePr>
   </w:style>
-  <w:style w:type="table" w:styleId="14">
+  <w:style w:type="table" w:styleId="706">
     <w:name w:val="Plain Table 1"/>
-    <w:basedOn w:val="11"/>
+    <w:basedOn w:val="703"/>
     <w:uiPriority w:val="59"/>
     <w:pPr>
       <w:pBdr/>
@@ -2963,9 +2888,9 @@
       </w:tcPr>
     </w:tblStylePr>
   </w:style>
-  <w:style w:type="table" w:styleId="15">
+  <w:style w:type="table" w:styleId="707">
     <w:name w:val="Plain Table 2"/>
-    <w:basedOn w:val="11"/>
+    <w:basedOn w:val="703"/>
     <w:uiPriority w:val="59"/>
     <w:pPr>
       <w:pBdr/>
@@ -3196,9 +3121,9 @@
       </w:tcPr>
     </w:tblStylePr>
   </w:style>
-  <w:style w:type="table" w:styleId="16">
+  <w:style w:type="table" w:styleId="708">
     <w:name w:val="Plain Table 3"/>
-    <w:basedOn w:val="11"/>
+    <w:basedOn w:val="703"/>
     <w:uiPriority w:val="99"/>
     <w:pPr>
       <w:pBdr/>
@@ -3426,9 +3351,9 @@
       </w:tcPr>
     </w:tblStylePr>
   </w:style>
-  <w:style w:type="table" w:styleId="17">
+  <w:style w:type="table" w:styleId="709">
     <w:name w:val="Plain Table 4"/>
-    <w:basedOn w:val="11"/>
+    <w:basedOn w:val="703"/>
     <w:uiPriority w:val="99"/>
     <w:pPr>
       <w:pBdr/>
@@ -3642,9 +3567,9 @@
       </w:tcPr>
     </w:tblStylePr>
   </w:style>
-  <w:style w:type="table" w:styleId="18">
+  <w:style w:type="table" w:styleId="710">
     <w:name w:val="Plain Table 5"/>
-    <w:basedOn w:val="11"/>
+    <w:basedOn w:val="703"/>
     <w:uiPriority w:val="99"/>
     <w:pPr>
       <w:pBdr/>
@@ -3875,9 +3800,9 @@
       </w:tcPr>
     </w:tblStylePr>
   </w:style>
-  <w:style w:type="table" w:styleId="19">
+  <w:style w:type="table" w:styleId="711">
     <w:name w:val="Grid Table 1 Light"/>
-    <w:basedOn w:val="11"/>
+    <w:basedOn w:val="703"/>
     <w:uiPriority w:val="99"/>
     <w:pPr>
       <w:pBdr/>
@@ -4098,9 +4023,9 @@
       </w:tcPr>
     </w:tblStylePr>
   </w:style>
-  <w:style w:type="table" w:styleId="20">
+  <w:style w:type="table" w:styleId="712">
     <w:name w:val="Grid Table 1 Light - Accent 1"/>
-    <w:basedOn w:val="11"/>
+    <w:basedOn w:val="703"/>
     <w:uiPriority w:val="99"/>
     <w:pPr>
       <w:pBdr/>
@@ -4321,9 +4246,9 @@
       </w:tcPr>
     </w:tblStylePr>
   </w:style>
-  <w:style w:type="table" w:styleId="21">
+  <w:style w:type="table" w:styleId="713">
     <w:name w:val="Grid Table 1 Light - Accent 2"/>
-    <w:basedOn w:val="11"/>
+    <w:basedOn w:val="703"/>
     <w:uiPriority w:val="99"/>
     <w:pPr>
       <w:pBdr/>
@@ -4544,9 +4469,9 @@
       </w:tcPr>
     </w:tblStylePr>
   </w:style>
-  <w:style w:type="table" w:styleId="22">
+  <w:style w:type="table" w:styleId="714">
     <w:name w:val="Grid Table 1 Light - Accent 3"/>
-    <w:basedOn w:val="11"/>
+    <w:basedOn w:val="703"/>
     <w:uiPriority w:val="99"/>
     <w:pPr>
       <w:pBdr/>
@@ -4767,9 +4692,9 @@
       </w:tcPr>
     </w:tblStylePr>
   </w:style>
-  <w:style w:type="table" w:styleId="23">
+  <w:style w:type="table" w:styleId="715">
     <w:name w:val="Grid Table 1 Light - Accent 4"/>
-    <w:basedOn w:val="11"/>
+    <w:basedOn w:val="703"/>
     <w:uiPriority w:val="99"/>
     <w:pPr>
       <w:pBdr/>
@@ -4990,9 +4915,9 @@
       </w:tcPr>
     </w:tblStylePr>
   </w:style>
-  <w:style w:type="table" w:styleId="24">
+  <w:style w:type="table" w:styleId="716">
     <w:name w:val="Grid Table 1 Light - Accent 5"/>
-    <w:basedOn w:val="11"/>
+    <w:basedOn w:val="703"/>
     <w:uiPriority w:val="99"/>
     <w:pPr>
       <w:pBdr/>
@@ -5213,9 +5138,9 @@
       </w:tcPr>
     </w:tblStylePr>
   </w:style>
-  <w:style w:type="table" w:styleId="25">
+  <w:style w:type="table" w:styleId="717">
     <w:name w:val="Grid Table 1 Light - Accent 6"/>
-    <w:basedOn w:val="11"/>
+    <w:basedOn w:val="703"/>
     <w:uiPriority w:val="99"/>
     <w:pPr>
       <w:pBdr/>
@@ -5436,9 +5361,9 @@
       </w:tcPr>
     </w:tblStylePr>
   </w:style>
-  <w:style w:type="table" w:styleId="26">
+  <w:style w:type="table" w:styleId="718">
     <w:name w:val="Grid Table 2"/>
-    <w:basedOn w:val="11"/>
+    <w:basedOn w:val="703"/>
     <w:uiPriority w:val="99"/>
     <w:pPr>
       <w:pBdr/>
@@ -5668,9 +5593,9 @@
       </w:tcPr>
     </w:tblStylePr>
   </w:style>
-  <w:style w:type="table" w:styleId="27">
+  <w:style w:type="table" w:styleId="719">
     <w:name w:val="Grid Table 2 - Accent 1"/>
-    <w:basedOn w:val="11"/>
+    <w:basedOn w:val="703"/>
     <w:uiPriority w:val="99"/>
     <w:pPr>
       <w:pBdr/>
@@ -5900,9 +5825,9 @@
       </w:tcPr>
     </w:tblStylePr>
   </w:style>
-  <w:style w:type="table" w:styleId="28">
+  <w:style w:type="table" w:styleId="720">
     <w:name w:val="Grid Table 2 - Accent 2"/>
-    <w:basedOn w:val="11"/>
+    <w:basedOn w:val="703"/>
     <w:uiPriority w:val="99"/>
     <w:pPr>
       <w:pBdr/>
@@ -6132,9 +6057,9 @@
       </w:tcPr>
     </w:tblStylePr>
   </w:style>
-  <w:style w:type="table" w:styleId="29">
+  <w:style w:type="table" w:styleId="721">
     <w:name w:val="Grid Table 2 - Accent 3"/>
-    <w:basedOn w:val="11"/>
+    <w:basedOn w:val="703"/>
     <w:uiPriority w:val="99"/>
     <w:pPr>
       <w:pBdr/>
@@ -6364,9 +6289,9 @@
       </w:tcPr>
     </w:tblStylePr>
   </w:style>
-  <w:style w:type="table" w:styleId="30">
+  <w:style w:type="table" w:styleId="722">
     <w:name w:val="Grid Table 2 - Accent 4"/>
-    <w:basedOn w:val="11"/>
+    <w:basedOn w:val="703"/>
     <w:uiPriority w:val="99"/>
     <w:pPr>
       <w:pBdr/>
@@ -6596,9 +6521,9 @@
       </w:tcPr>
     </w:tblStylePr>
   </w:style>
-  <w:style w:type="table" w:styleId="31">
+  <w:style w:type="table" w:styleId="723">
     <w:name w:val="Grid Table 2 - Accent 5"/>
-    <w:basedOn w:val="11"/>
+    <w:basedOn w:val="703"/>
     <w:uiPriority w:val="99"/>
     <w:pPr>
       <w:pBdr/>
@@ -6828,9 +6753,9 @@
       </w:tcPr>
     </w:tblStylePr>
   </w:style>
-  <w:style w:type="table" w:styleId="32">
+  <w:style w:type="table" w:styleId="724">
     <w:name w:val="Grid Table 2 - Accent 6"/>
-    <w:basedOn w:val="11"/>
+    <w:basedOn w:val="703"/>
     <w:uiPriority w:val="99"/>
     <w:pPr>
       <w:pBdr/>
@@ -7060,9 +6985,9 @@
       </w:tcPr>
     </w:tblStylePr>
   </w:style>
-  <w:style w:type="table" w:styleId="33">
+  <w:style w:type="table" w:styleId="725">
     <w:name w:val="Grid Table 3"/>
-    <w:basedOn w:val="11"/>
+    <w:basedOn w:val="703"/>
     <w:uiPriority w:val="99"/>
     <w:pPr>
       <w:pBdr/>
@@ -7161,29 +7086,6 @@
         <w:tblBorders/>
       </w:tblPr>
       <w:tcPr>
-        <w:shd w:color="ffffff"/>
-        <w:tcBorders>
-          <w:top w:val="none" w:color="000000" w:sz="4" w:space="0"/>
-          <w:left w:val="none" w:color="000000" w:sz="4" w:space="0"/>
-          <w:bottom w:val="none" w:color="000000" w:sz="4" w:space="0"/>
-          <w:right w:val="none" w:color="000000" w:sz="4" w:space="0"/>
-        </w:tcBorders>
-      </w:tcPr>
-    </w:tblStylePr>
-    <w:tblStylePr w:type="firstRow">
-      <w:rPr>
-        <w:b/>
-        <w:color w:val="404040"/>
-      </w:rPr>
-      <w:pPr>
-        <w:pBdr/>
-        <w:spacing/>
-        <w:ind/>
-      </w:pPr>
-      <w:tblPr>
-        <w:tblBorders/>
-      </w:tblPr>
-      <w:tcPr>
         <w:shd w:val="clear" w:color="ffffff"/>
         <w:tcBorders>
           <w:top w:val="none" w:color="000000" w:sz="4" w:space="0"/>
@@ -7193,30 +7095,7 @@
         </w:tcBorders>
       </w:tcPr>
     </w:tblStylePr>
-    <w:tblStylePr w:type="lastCol">
-      <w:rPr>
-        <w:i/>
-        <w:color w:val="404040"/>
-      </w:rPr>
-      <w:pPr>
-        <w:pBdr/>
-        <w:spacing/>
-        <w:ind/>
-      </w:pPr>
-      <w:tblPr>
-        <w:tblBorders/>
-      </w:tblPr>
-      <w:tcPr>
-        <w:shd w:color="ffffff"/>
-        <w:tcBorders>
-          <w:top w:val="none" w:color="000000" w:sz="4" w:space="0"/>
-          <w:left w:val="none" w:color="000000" w:sz="4" w:space="0"/>
-          <w:bottom w:val="none" w:color="000000" w:sz="4" w:space="0"/>
-          <w:right w:val="none" w:color="000000" w:sz="4" w:space="0"/>
-        </w:tcBorders>
-      </w:tcPr>
-    </w:tblStylePr>
-    <w:tblStylePr w:type="lastRow">
+    <w:tblStylePr w:type="firstRow">
       <w:rPr>
         <w:b/>
         <w:color w:val="404040"/>
@@ -7239,6 +7118,52 @@
         </w:tcBorders>
       </w:tcPr>
     </w:tblStylePr>
+    <w:tblStylePr w:type="lastCol">
+      <w:rPr>
+        <w:i/>
+        <w:color w:val="404040"/>
+      </w:rPr>
+      <w:pPr>
+        <w:pBdr/>
+        <w:spacing/>
+        <w:ind/>
+      </w:pPr>
+      <w:tblPr>
+        <w:tblBorders/>
+      </w:tblPr>
+      <w:tcPr>
+        <w:shd w:val="clear" w:color="ffffff"/>
+        <w:tcBorders>
+          <w:top w:val="none" w:color="000000" w:sz="4" w:space="0"/>
+          <w:left w:val="none" w:color="000000" w:sz="4" w:space="0"/>
+          <w:bottom w:val="none" w:color="000000" w:sz="4" w:space="0"/>
+          <w:right w:val="none" w:color="000000" w:sz="4" w:space="0"/>
+        </w:tcBorders>
+      </w:tcPr>
+    </w:tblStylePr>
+    <w:tblStylePr w:type="lastRow">
+      <w:rPr>
+        <w:b/>
+        <w:color w:val="404040"/>
+      </w:rPr>
+      <w:pPr>
+        <w:pBdr/>
+        <w:spacing/>
+        <w:ind/>
+      </w:pPr>
+      <w:tblPr>
+        <w:tblBorders/>
+      </w:tblPr>
+      <w:tcPr>
+        <w:shd w:val="clear" w:color="ffffff"/>
+        <w:tcBorders>
+          <w:top w:val="none" w:color="000000" w:sz="4" w:space="0"/>
+          <w:left w:val="none" w:color="000000" w:sz="4" w:space="0"/>
+          <w:bottom w:val="none" w:color="000000" w:sz="4" w:space="0"/>
+          <w:right w:val="none" w:color="000000" w:sz="4" w:space="0"/>
+        </w:tcBorders>
+      </w:tcPr>
+    </w:tblStylePr>
     <w:tblStylePr w:type="nwCell">
       <w:pPr>
         <w:pBdr/>
@@ -7305,9 +7230,9 @@
       </w:tcPr>
     </w:tblStylePr>
   </w:style>
-  <w:style w:type="table" w:styleId="34">
+  <w:style w:type="table" w:styleId="726">
     <w:name w:val="Grid Table 3 - Accent 1"/>
-    <w:basedOn w:val="11"/>
+    <w:basedOn w:val="703"/>
     <w:uiPriority w:val="99"/>
     <w:pPr>
       <w:pBdr/>
@@ -7406,29 +7331,6 @@
         <w:tblBorders/>
       </w:tblPr>
       <w:tcPr>
-        <w:shd w:color="ffffff"/>
-        <w:tcBorders>
-          <w:top w:val="none" w:color="000000" w:sz="4" w:space="0"/>
-          <w:left w:val="none" w:color="000000" w:sz="4" w:space="0"/>
-          <w:bottom w:val="none" w:color="000000" w:sz="4" w:space="0"/>
-          <w:right w:val="none" w:color="000000" w:sz="4" w:space="0"/>
-        </w:tcBorders>
-      </w:tcPr>
-    </w:tblStylePr>
-    <w:tblStylePr w:type="firstRow">
-      <w:rPr>
-        <w:b/>
-        <w:color w:val="404040"/>
-      </w:rPr>
-      <w:pPr>
-        <w:pBdr/>
-        <w:spacing/>
-        <w:ind/>
-      </w:pPr>
-      <w:tblPr>
-        <w:tblBorders/>
-      </w:tblPr>
-      <w:tcPr>
         <w:shd w:val="clear" w:color="ffffff"/>
         <w:tcBorders>
           <w:top w:val="none" w:color="000000" w:sz="4" w:space="0"/>
@@ -7438,30 +7340,7 @@
         </w:tcBorders>
       </w:tcPr>
     </w:tblStylePr>
-    <w:tblStylePr w:type="lastCol">
-      <w:rPr>
-        <w:i/>
-        <w:color w:val="404040"/>
-      </w:rPr>
-      <w:pPr>
-        <w:pBdr/>
-        <w:spacing/>
-        <w:ind/>
-      </w:pPr>
-      <w:tblPr>
-        <w:tblBorders/>
-      </w:tblPr>
-      <w:tcPr>
-        <w:shd w:color="ffffff"/>
-        <w:tcBorders>
-          <w:top w:val="none" w:color="000000" w:sz="4" w:space="0"/>
-          <w:left w:val="none" w:color="000000" w:sz="4" w:space="0"/>
-          <w:bottom w:val="none" w:color="000000" w:sz="4" w:space="0"/>
-          <w:right w:val="none" w:color="000000" w:sz="4" w:space="0"/>
-        </w:tcBorders>
-      </w:tcPr>
-    </w:tblStylePr>
-    <w:tblStylePr w:type="lastRow">
+    <w:tblStylePr w:type="firstRow">
       <w:rPr>
         <w:b/>
         <w:color w:val="404040"/>
@@ -7484,6 +7363,52 @@
         </w:tcBorders>
       </w:tcPr>
     </w:tblStylePr>
+    <w:tblStylePr w:type="lastCol">
+      <w:rPr>
+        <w:i/>
+        <w:color w:val="404040"/>
+      </w:rPr>
+      <w:pPr>
+        <w:pBdr/>
+        <w:spacing/>
+        <w:ind/>
+      </w:pPr>
+      <w:tblPr>
+        <w:tblBorders/>
+      </w:tblPr>
+      <w:tcPr>
+        <w:shd w:val="clear" w:color="ffffff"/>
+        <w:tcBorders>
+          <w:top w:val="none" w:color="000000" w:sz="4" w:space="0"/>
+          <w:left w:val="none" w:color="000000" w:sz="4" w:space="0"/>
+          <w:bottom w:val="none" w:color="000000" w:sz="4" w:space="0"/>
+          <w:right w:val="none" w:color="000000" w:sz="4" w:space="0"/>
+        </w:tcBorders>
+      </w:tcPr>
+    </w:tblStylePr>
+    <w:tblStylePr w:type="lastRow">
+      <w:rPr>
+        <w:b/>
+        <w:color w:val="404040"/>
+      </w:rPr>
+      <w:pPr>
+        <w:pBdr/>
+        <w:spacing/>
+        <w:ind/>
+      </w:pPr>
+      <w:tblPr>
+        <w:tblBorders/>
+      </w:tblPr>
+      <w:tcPr>
+        <w:shd w:val="clear" w:color="ffffff"/>
+        <w:tcBorders>
+          <w:top w:val="none" w:color="000000" w:sz="4" w:space="0"/>
+          <w:left w:val="none" w:color="000000" w:sz="4" w:space="0"/>
+          <w:bottom w:val="none" w:color="000000" w:sz="4" w:space="0"/>
+          <w:right w:val="none" w:color="000000" w:sz="4" w:space="0"/>
+        </w:tcBorders>
+      </w:tcPr>
+    </w:tblStylePr>
     <w:tblStylePr w:type="nwCell">
       <w:pPr>
         <w:pBdr/>
@@ -7550,9 +7475,9 @@
       </w:tcPr>
     </w:tblStylePr>
   </w:style>
-  <w:style w:type="table" w:styleId="35">
+  <w:style w:type="table" w:styleId="727">
     <w:name w:val="Grid Table 3 - Accent 2"/>
-    <w:basedOn w:val="11"/>
+    <w:basedOn w:val="703"/>
     <w:uiPriority w:val="99"/>
     <w:pPr>
       <w:pBdr/>
@@ -7651,29 +7576,6 @@
         <w:tblBorders/>
       </w:tblPr>
       <w:tcPr>
-        <w:shd w:color="ffffff"/>
-        <w:tcBorders>
-          <w:top w:val="none" w:color="000000" w:sz="4" w:space="0"/>
-          <w:left w:val="none" w:color="000000" w:sz="4" w:space="0"/>
-          <w:bottom w:val="none" w:color="000000" w:sz="4" w:space="0"/>
-          <w:right w:val="none" w:color="000000" w:sz="4" w:space="0"/>
-        </w:tcBorders>
-      </w:tcPr>
-    </w:tblStylePr>
-    <w:tblStylePr w:type="firstRow">
-      <w:rPr>
-        <w:b/>
-        <w:color w:val="404040"/>
-      </w:rPr>
-      <w:pPr>
-        <w:pBdr/>
-        <w:spacing/>
-        <w:ind/>
-      </w:pPr>
-      <w:tblPr>
-        <w:tblBorders/>
-      </w:tblPr>
-      <w:tcPr>
         <w:shd w:val="clear" w:color="ffffff"/>
         <w:tcBorders>
           <w:top w:val="none" w:color="000000" w:sz="4" w:space="0"/>
@@ -7683,30 +7585,7 @@
         </w:tcBorders>
       </w:tcPr>
     </w:tblStylePr>
-    <w:tblStylePr w:type="lastCol">
-      <w:rPr>
-        <w:i/>
-        <w:color w:val="404040"/>
-      </w:rPr>
-      <w:pPr>
-        <w:pBdr/>
-        <w:spacing/>
-        <w:ind/>
-      </w:pPr>
-      <w:tblPr>
-        <w:tblBorders/>
-      </w:tblPr>
-      <w:tcPr>
-        <w:shd w:color="ffffff"/>
-        <w:tcBorders>
-          <w:top w:val="none" w:color="000000" w:sz="4" w:space="0"/>
-          <w:left w:val="none" w:color="000000" w:sz="4" w:space="0"/>
-          <w:bottom w:val="none" w:color="000000" w:sz="4" w:space="0"/>
-          <w:right w:val="none" w:color="000000" w:sz="4" w:space="0"/>
-        </w:tcBorders>
-      </w:tcPr>
-    </w:tblStylePr>
-    <w:tblStylePr w:type="lastRow">
+    <w:tblStylePr w:type="firstRow">
       <w:rPr>
         <w:b/>
         <w:color w:val="404040"/>
@@ -7729,6 +7608,52 @@
         </w:tcBorders>
       </w:tcPr>
     </w:tblStylePr>
+    <w:tblStylePr w:type="lastCol">
+      <w:rPr>
+        <w:i/>
+        <w:color w:val="404040"/>
+      </w:rPr>
+      <w:pPr>
+        <w:pBdr/>
+        <w:spacing/>
+        <w:ind/>
+      </w:pPr>
+      <w:tblPr>
+        <w:tblBorders/>
+      </w:tblPr>
+      <w:tcPr>
+        <w:shd w:val="clear" w:color="ffffff"/>
+        <w:tcBorders>
+          <w:top w:val="none" w:color="000000" w:sz="4" w:space="0"/>
+          <w:left w:val="none" w:color="000000" w:sz="4" w:space="0"/>
+          <w:bottom w:val="none" w:color="000000" w:sz="4" w:space="0"/>
+          <w:right w:val="none" w:color="000000" w:sz="4" w:space="0"/>
+        </w:tcBorders>
+      </w:tcPr>
+    </w:tblStylePr>
+    <w:tblStylePr w:type="lastRow">
+      <w:rPr>
+        <w:b/>
+        <w:color w:val="404040"/>
+      </w:rPr>
+      <w:pPr>
+        <w:pBdr/>
+        <w:spacing/>
+        <w:ind/>
+      </w:pPr>
+      <w:tblPr>
+        <w:tblBorders/>
+      </w:tblPr>
+      <w:tcPr>
+        <w:shd w:val="clear" w:color="ffffff"/>
+        <w:tcBorders>
+          <w:top w:val="none" w:color="000000" w:sz="4" w:space="0"/>
+          <w:left w:val="none" w:color="000000" w:sz="4" w:space="0"/>
+          <w:bottom w:val="none" w:color="000000" w:sz="4" w:space="0"/>
+          <w:right w:val="none" w:color="000000" w:sz="4" w:space="0"/>
+        </w:tcBorders>
+      </w:tcPr>
+    </w:tblStylePr>
     <w:tblStylePr w:type="nwCell">
       <w:pPr>
         <w:pBdr/>
@@ -7795,9 +7720,9 @@
       </w:tcPr>
     </w:tblStylePr>
   </w:style>
-  <w:style w:type="table" w:styleId="36">
+  <w:style w:type="table" w:styleId="728">
     <w:name w:val="Grid Table 3 - Accent 3"/>
-    <w:basedOn w:val="11"/>
+    <w:basedOn w:val="703"/>
     <w:uiPriority w:val="99"/>
     <w:pPr>
       <w:pBdr/>
@@ -7896,29 +7821,6 @@
         <w:tblBorders/>
       </w:tblPr>
       <w:tcPr>
-        <w:shd w:color="ffffff"/>
-        <w:tcBorders>
-          <w:top w:val="none" w:color="000000" w:sz="4" w:space="0"/>
-          <w:left w:val="none" w:color="000000" w:sz="4" w:space="0"/>
-          <w:bottom w:val="none" w:color="000000" w:sz="4" w:space="0"/>
-          <w:right w:val="none" w:color="000000" w:sz="4" w:space="0"/>
-        </w:tcBorders>
-      </w:tcPr>
-    </w:tblStylePr>
-    <w:tblStylePr w:type="firstRow">
-      <w:rPr>
-        <w:b/>
-        <w:color w:val="404040"/>
-      </w:rPr>
-      <w:pPr>
-        <w:pBdr/>
-        <w:spacing/>
-        <w:ind/>
-      </w:pPr>
-      <w:tblPr>
-        <w:tblBorders/>
-      </w:tblPr>
-      <w:tcPr>
         <w:shd w:val="clear" w:color="ffffff"/>
         <w:tcBorders>
           <w:top w:val="none" w:color="000000" w:sz="4" w:space="0"/>
@@ -7928,30 +7830,7 @@
         </w:tcBorders>
       </w:tcPr>
     </w:tblStylePr>
-    <w:tblStylePr w:type="lastCol">
-      <w:rPr>
-        <w:i/>
-        <w:color w:val="404040"/>
-      </w:rPr>
-      <w:pPr>
-        <w:pBdr/>
-        <w:spacing/>
-        <w:ind/>
-      </w:pPr>
-      <w:tblPr>
-        <w:tblBorders/>
-      </w:tblPr>
-      <w:tcPr>
-        <w:shd w:color="ffffff"/>
-        <w:tcBorders>
-          <w:top w:val="none" w:color="000000" w:sz="4" w:space="0"/>
-          <w:left w:val="none" w:color="000000" w:sz="4" w:space="0"/>
-          <w:bottom w:val="none" w:color="000000" w:sz="4" w:space="0"/>
-          <w:right w:val="none" w:color="000000" w:sz="4" w:space="0"/>
-        </w:tcBorders>
-      </w:tcPr>
-    </w:tblStylePr>
-    <w:tblStylePr w:type="lastRow">
+    <w:tblStylePr w:type="firstRow">
       <w:rPr>
         <w:b/>
         <w:color w:val="404040"/>
@@ -7974,6 +7853,52 @@
         </w:tcBorders>
       </w:tcPr>
     </w:tblStylePr>
+    <w:tblStylePr w:type="lastCol">
+      <w:rPr>
+        <w:i/>
+        <w:color w:val="404040"/>
+      </w:rPr>
+      <w:pPr>
+        <w:pBdr/>
+        <w:spacing/>
+        <w:ind/>
+      </w:pPr>
+      <w:tblPr>
+        <w:tblBorders/>
+      </w:tblPr>
+      <w:tcPr>
+        <w:shd w:val="clear" w:color="ffffff"/>
+        <w:tcBorders>
+          <w:top w:val="none" w:color="000000" w:sz="4" w:space="0"/>
+          <w:left w:val="none" w:color="000000" w:sz="4" w:space="0"/>
+          <w:bottom w:val="none" w:color="000000" w:sz="4" w:space="0"/>
+          <w:right w:val="none" w:color="000000" w:sz="4" w:space="0"/>
+        </w:tcBorders>
+      </w:tcPr>
+    </w:tblStylePr>
+    <w:tblStylePr w:type="lastRow">
+      <w:rPr>
+        <w:b/>
+        <w:color w:val="404040"/>
+      </w:rPr>
+      <w:pPr>
+        <w:pBdr/>
+        <w:spacing/>
+        <w:ind/>
+      </w:pPr>
+      <w:tblPr>
+        <w:tblBorders/>
+      </w:tblPr>
+      <w:tcPr>
+        <w:shd w:val="clear" w:color="ffffff"/>
+        <w:tcBorders>
+          <w:top w:val="none" w:color="000000" w:sz="4" w:space="0"/>
+          <w:left w:val="none" w:color="000000" w:sz="4" w:space="0"/>
+          <w:bottom w:val="none" w:color="000000" w:sz="4" w:space="0"/>
+          <w:right w:val="none" w:color="000000" w:sz="4" w:space="0"/>
+        </w:tcBorders>
+      </w:tcPr>
+    </w:tblStylePr>
     <w:tblStylePr w:type="nwCell">
       <w:pPr>
         <w:pBdr/>
@@ -8040,9 +7965,9 @@
       </w:tcPr>
     </w:tblStylePr>
   </w:style>
-  <w:style w:type="table" w:styleId="37">
+  <w:style w:type="table" w:styleId="729">
     <w:name w:val="Grid Table 3 - Accent 4"/>
-    <w:basedOn w:val="11"/>
+    <w:basedOn w:val="703"/>
     <w:uiPriority w:val="99"/>
     <w:pPr>
       <w:pBdr/>
@@ -8141,29 +8066,6 @@
         <w:tblBorders/>
       </w:tblPr>
       <w:tcPr>
-        <w:shd w:color="ffffff"/>
-        <w:tcBorders>
-          <w:top w:val="none" w:color="000000" w:sz="4" w:space="0"/>
-          <w:left w:val="none" w:color="000000" w:sz="4" w:space="0"/>
-          <w:bottom w:val="none" w:color="000000" w:sz="4" w:space="0"/>
-          <w:right w:val="none" w:color="000000" w:sz="4" w:space="0"/>
-        </w:tcBorders>
-      </w:tcPr>
-    </w:tblStylePr>
-    <w:tblStylePr w:type="firstRow">
-      <w:rPr>
-        <w:b/>
-        <w:color w:val="404040"/>
-      </w:rPr>
-      <w:pPr>
-        <w:pBdr/>
-        <w:spacing/>
-        <w:ind/>
-      </w:pPr>
-      <w:tblPr>
-        <w:tblBorders/>
-      </w:tblPr>
-      <w:tcPr>
         <w:shd w:val="clear" w:color="ffffff"/>
         <w:tcBorders>
           <w:top w:val="none" w:color="000000" w:sz="4" w:space="0"/>
@@ -8173,30 +8075,7 @@
         </w:tcBorders>
       </w:tcPr>
     </w:tblStylePr>
-    <w:tblStylePr w:type="lastCol">
-      <w:rPr>
-        <w:i/>
-        <w:color w:val="404040"/>
-      </w:rPr>
-      <w:pPr>
-        <w:pBdr/>
-        <w:spacing/>
-        <w:ind/>
-      </w:pPr>
-      <w:tblPr>
-        <w:tblBorders/>
-      </w:tblPr>
-      <w:tcPr>
-        <w:shd w:color="ffffff"/>
-        <w:tcBorders>
-          <w:top w:val="none" w:color="000000" w:sz="4" w:space="0"/>
-          <w:left w:val="none" w:color="000000" w:sz="4" w:space="0"/>
-          <w:bottom w:val="none" w:color="000000" w:sz="4" w:space="0"/>
-          <w:right w:val="none" w:color="000000" w:sz="4" w:space="0"/>
-        </w:tcBorders>
-      </w:tcPr>
-    </w:tblStylePr>
-    <w:tblStylePr w:type="lastRow">
+    <w:tblStylePr w:type="firstRow">
       <w:rPr>
         <w:b/>
         <w:color w:val="404040"/>
@@ -8219,6 +8098,52 @@
         </w:tcBorders>
       </w:tcPr>
     </w:tblStylePr>
+    <w:tblStylePr w:type="lastCol">
+      <w:rPr>
+        <w:i/>
+        <w:color w:val="404040"/>
+      </w:rPr>
+      <w:pPr>
+        <w:pBdr/>
+        <w:spacing/>
+        <w:ind/>
+      </w:pPr>
+      <w:tblPr>
+        <w:tblBorders/>
+      </w:tblPr>
+      <w:tcPr>
+        <w:shd w:val="clear" w:color="ffffff"/>
+        <w:tcBorders>
+          <w:top w:val="none" w:color="000000" w:sz="4" w:space="0"/>
+          <w:left w:val="none" w:color="000000" w:sz="4" w:space="0"/>
+          <w:bottom w:val="none" w:color="000000" w:sz="4" w:space="0"/>
+          <w:right w:val="none" w:color="000000" w:sz="4" w:space="0"/>
+        </w:tcBorders>
+      </w:tcPr>
+    </w:tblStylePr>
+    <w:tblStylePr w:type="lastRow">
+      <w:rPr>
+        <w:b/>
+        <w:color w:val="404040"/>
+      </w:rPr>
+      <w:pPr>
+        <w:pBdr/>
+        <w:spacing/>
+        <w:ind/>
+      </w:pPr>
+      <w:tblPr>
+        <w:tblBorders/>
+      </w:tblPr>
+      <w:tcPr>
+        <w:shd w:val="clear" w:color="ffffff"/>
+        <w:tcBorders>
+          <w:top w:val="none" w:color="000000" w:sz="4" w:space="0"/>
+          <w:left w:val="none" w:color="000000" w:sz="4" w:space="0"/>
+          <w:bottom w:val="none" w:color="000000" w:sz="4" w:space="0"/>
+          <w:right w:val="none" w:color="000000" w:sz="4" w:space="0"/>
+        </w:tcBorders>
+      </w:tcPr>
+    </w:tblStylePr>
     <w:tblStylePr w:type="nwCell">
       <w:pPr>
         <w:pBdr/>
@@ -8285,9 +8210,9 @@
       </w:tcPr>
     </w:tblStylePr>
   </w:style>
-  <w:style w:type="table" w:styleId="38">
+  <w:style w:type="table" w:styleId="730">
     <w:name w:val="Grid Table 3 - Accent 5"/>
-    <w:basedOn w:val="11"/>
+    <w:basedOn w:val="703"/>
     <w:uiPriority w:val="99"/>
     <w:pPr>
       <w:pBdr/>
@@ -8386,29 +8311,6 @@
         <w:tblBorders/>
       </w:tblPr>
       <w:tcPr>
-        <w:shd w:color="ffffff"/>
-        <w:tcBorders>
-          <w:top w:val="none" w:color="000000" w:sz="4" w:space="0"/>
-          <w:left w:val="none" w:color="000000" w:sz="4" w:space="0"/>
-          <w:bottom w:val="none" w:color="000000" w:sz="4" w:space="0"/>
-          <w:right w:val="none" w:color="000000" w:sz="4" w:space="0"/>
-        </w:tcBorders>
-      </w:tcPr>
-    </w:tblStylePr>
-    <w:tblStylePr w:type="firstRow">
-      <w:rPr>
-        <w:b/>
-        <w:color w:val="404040"/>
-      </w:rPr>
-      <w:pPr>
-        <w:pBdr/>
-        <w:spacing/>
-        <w:ind/>
-      </w:pPr>
-      <w:tblPr>
-        <w:tblBorders/>
-      </w:tblPr>
-      <w:tcPr>
         <w:shd w:val="clear" w:color="ffffff"/>
         <w:tcBorders>
           <w:top w:val="none" w:color="000000" w:sz="4" w:space="0"/>
@@ -8418,30 +8320,7 @@
         </w:tcBorders>
       </w:tcPr>
     </w:tblStylePr>
-    <w:tblStylePr w:type="lastCol">
-      <w:rPr>
-        <w:i/>
-        <w:color w:val="404040"/>
-      </w:rPr>
-      <w:pPr>
-        <w:pBdr/>
-        <w:spacing/>
-        <w:ind/>
-      </w:pPr>
-      <w:tblPr>
-        <w:tblBorders/>
-      </w:tblPr>
-      <w:tcPr>
-        <w:shd w:color="ffffff"/>
-        <w:tcBorders>
-          <w:top w:val="none" w:color="000000" w:sz="4" w:space="0"/>
-          <w:left w:val="none" w:color="000000" w:sz="4" w:space="0"/>
-          <w:bottom w:val="none" w:color="000000" w:sz="4" w:space="0"/>
-          <w:right w:val="none" w:color="000000" w:sz="4" w:space="0"/>
-        </w:tcBorders>
-      </w:tcPr>
-    </w:tblStylePr>
-    <w:tblStylePr w:type="lastRow">
+    <w:tblStylePr w:type="firstRow">
       <w:rPr>
         <w:b/>
         <w:color w:val="404040"/>
@@ -8464,6 +8343,52 @@
         </w:tcBorders>
       </w:tcPr>
     </w:tblStylePr>
+    <w:tblStylePr w:type="lastCol">
+      <w:rPr>
+        <w:i/>
+        <w:color w:val="404040"/>
+      </w:rPr>
+      <w:pPr>
+        <w:pBdr/>
+        <w:spacing/>
+        <w:ind/>
+      </w:pPr>
+      <w:tblPr>
+        <w:tblBorders/>
+      </w:tblPr>
+      <w:tcPr>
+        <w:shd w:val="clear" w:color="ffffff"/>
+        <w:tcBorders>
+          <w:top w:val="none" w:color="000000" w:sz="4" w:space="0"/>
+          <w:left w:val="none" w:color="000000" w:sz="4" w:space="0"/>
+          <w:bottom w:val="none" w:color="000000" w:sz="4" w:space="0"/>
+          <w:right w:val="none" w:color="000000" w:sz="4" w:space="0"/>
+        </w:tcBorders>
+      </w:tcPr>
+    </w:tblStylePr>
+    <w:tblStylePr w:type="lastRow">
+      <w:rPr>
+        <w:b/>
+        <w:color w:val="404040"/>
+      </w:rPr>
+      <w:pPr>
+        <w:pBdr/>
+        <w:spacing/>
+        <w:ind/>
+      </w:pPr>
+      <w:tblPr>
+        <w:tblBorders/>
+      </w:tblPr>
+      <w:tcPr>
+        <w:shd w:val="clear" w:color="ffffff"/>
+        <w:tcBorders>
+          <w:top w:val="none" w:color="000000" w:sz="4" w:space="0"/>
+          <w:left w:val="none" w:color="000000" w:sz="4" w:space="0"/>
+          <w:bottom w:val="none" w:color="000000" w:sz="4" w:space="0"/>
+          <w:right w:val="none" w:color="000000" w:sz="4" w:space="0"/>
+        </w:tcBorders>
+      </w:tcPr>
+    </w:tblStylePr>
     <w:tblStylePr w:type="nwCell">
       <w:pPr>
         <w:pBdr/>
@@ -8530,9 +8455,9 @@
       </w:tcPr>
     </w:tblStylePr>
   </w:style>
-  <w:style w:type="table" w:styleId="39">
+  <w:style w:type="table" w:styleId="731">
     <w:name w:val="Grid Table 3 - Accent 6"/>
-    <w:basedOn w:val="11"/>
+    <w:basedOn w:val="703"/>
     <w:uiPriority w:val="99"/>
     <w:pPr>
       <w:pBdr/>
@@ -8631,29 +8556,6 @@
         <w:tblBorders/>
       </w:tblPr>
       <w:tcPr>
-        <w:shd w:color="ffffff"/>
-        <w:tcBorders>
-          <w:top w:val="none" w:color="000000" w:sz="4" w:space="0"/>
-          <w:left w:val="none" w:color="000000" w:sz="4" w:space="0"/>
-          <w:bottom w:val="none" w:color="000000" w:sz="4" w:space="0"/>
-          <w:right w:val="none" w:color="000000" w:sz="4" w:space="0"/>
-        </w:tcBorders>
-      </w:tcPr>
-    </w:tblStylePr>
-    <w:tblStylePr w:type="firstRow">
-      <w:rPr>
-        <w:b/>
-        <w:color w:val="404040"/>
-      </w:rPr>
-      <w:pPr>
-        <w:pBdr/>
-        <w:spacing/>
-        <w:ind/>
-      </w:pPr>
-      <w:tblPr>
-        <w:tblBorders/>
-      </w:tblPr>
-      <w:tcPr>
         <w:shd w:val="clear" w:color="ffffff"/>
         <w:tcBorders>
           <w:top w:val="none" w:color="000000" w:sz="4" w:space="0"/>
@@ -8663,30 +8565,7 @@
         </w:tcBorders>
       </w:tcPr>
     </w:tblStylePr>
-    <w:tblStylePr w:type="lastCol">
-      <w:rPr>
-        <w:i/>
-        <w:color w:val="404040"/>
-      </w:rPr>
-      <w:pPr>
-        <w:pBdr/>
-        <w:spacing/>
-        <w:ind/>
-      </w:pPr>
-      <w:tblPr>
-        <w:tblBorders/>
-      </w:tblPr>
-      <w:tcPr>
-        <w:shd w:color="ffffff"/>
-        <w:tcBorders>
-          <w:top w:val="none" w:color="000000" w:sz="4" w:space="0"/>
-          <w:left w:val="none" w:color="000000" w:sz="4" w:space="0"/>
-          <w:bottom w:val="none" w:color="000000" w:sz="4" w:space="0"/>
-          <w:right w:val="none" w:color="000000" w:sz="4" w:space="0"/>
-        </w:tcBorders>
-      </w:tcPr>
-    </w:tblStylePr>
-    <w:tblStylePr w:type="lastRow">
+    <w:tblStylePr w:type="firstRow">
       <w:rPr>
         <w:b/>
         <w:color w:val="404040"/>
@@ -8709,6 +8588,52 @@
         </w:tcBorders>
       </w:tcPr>
     </w:tblStylePr>
+    <w:tblStylePr w:type="lastCol">
+      <w:rPr>
+        <w:i/>
+        <w:color w:val="404040"/>
+      </w:rPr>
+      <w:pPr>
+        <w:pBdr/>
+        <w:spacing/>
+        <w:ind/>
+      </w:pPr>
+      <w:tblPr>
+        <w:tblBorders/>
+      </w:tblPr>
+      <w:tcPr>
+        <w:shd w:val="clear" w:color="ffffff"/>
+        <w:tcBorders>
+          <w:top w:val="none" w:color="000000" w:sz="4" w:space="0"/>
+          <w:left w:val="none" w:color="000000" w:sz="4" w:space="0"/>
+          <w:bottom w:val="none" w:color="000000" w:sz="4" w:space="0"/>
+          <w:right w:val="none" w:color="000000" w:sz="4" w:space="0"/>
+        </w:tcBorders>
+      </w:tcPr>
+    </w:tblStylePr>
+    <w:tblStylePr w:type="lastRow">
+      <w:rPr>
+        <w:b/>
+        <w:color w:val="404040"/>
+      </w:rPr>
+      <w:pPr>
+        <w:pBdr/>
+        <w:spacing/>
+        <w:ind/>
+      </w:pPr>
+      <w:tblPr>
+        <w:tblBorders/>
+      </w:tblPr>
+      <w:tcPr>
+        <w:shd w:val="clear" w:color="ffffff"/>
+        <w:tcBorders>
+          <w:top w:val="none" w:color="000000" w:sz="4" w:space="0"/>
+          <w:left w:val="none" w:color="000000" w:sz="4" w:space="0"/>
+          <w:bottom w:val="none" w:color="000000" w:sz="4" w:space="0"/>
+          <w:right w:val="none" w:color="000000" w:sz="4" w:space="0"/>
+        </w:tcBorders>
+      </w:tcPr>
+    </w:tblStylePr>
     <w:tblStylePr w:type="nwCell">
       <w:pPr>
         <w:pBdr/>
@@ -8775,9 +8700,9 @@
       </w:tcPr>
     </w:tblStylePr>
   </w:style>
-  <w:style w:type="table" w:styleId="40">
+  <w:style w:type="table" w:styleId="732">
     <w:name w:val="Grid Table 4"/>
-    <w:basedOn w:val="11"/>
+    <w:basedOn w:val="703"/>
     <w:uiPriority w:val="59"/>
     <w:pPr>
       <w:pBdr/>
@@ -9008,9 +8933,9 @@
       </w:tcPr>
     </w:tblStylePr>
   </w:style>
-  <w:style w:type="table" w:styleId="41">
+  <w:style w:type="table" w:styleId="733">
     <w:name w:val="Grid Table 4 - Accent 1"/>
-    <w:basedOn w:val="11"/>
+    <w:basedOn w:val="703"/>
     <w:uiPriority w:val="59"/>
     <w:pPr>
       <w:pBdr/>
@@ -9241,9 +9166,9 @@
       </w:tcPr>
     </w:tblStylePr>
   </w:style>
-  <w:style w:type="table" w:styleId="42">
+  <w:style w:type="table" w:styleId="734">
     <w:name w:val="Grid Table 4 - Accent 2"/>
-    <w:basedOn w:val="11"/>
+    <w:basedOn w:val="703"/>
     <w:uiPriority w:val="59"/>
     <w:pPr>
       <w:pBdr/>
@@ -9474,9 +9399,9 @@
       </w:tcPr>
     </w:tblStylePr>
   </w:style>
-  <w:style w:type="table" w:styleId="43">
+  <w:style w:type="table" w:styleId="735">
     <w:name w:val="Grid Table 4 - Accent 3"/>
-    <w:basedOn w:val="11"/>
+    <w:basedOn w:val="703"/>
     <w:uiPriority w:val="59"/>
     <w:pPr>
       <w:pBdr/>
@@ -9707,9 +9632,9 @@
       </w:tcPr>
     </w:tblStylePr>
   </w:style>
-  <w:style w:type="table" w:styleId="44">
+  <w:style w:type="table" w:styleId="736">
     <w:name w:val="Grid Table 4 - Accent 4"/>
-    <w:basedOn w:val="11"/>
+    <w:basedOn w:val="703"/>
     <w:uiPriority w:val="59"/>
     <w:pPr>
       <w:pBdr/>
@@ -9940,9 +9865,9 @@
       </w:tcPr>
     </w:tblStylePr>
   </w:style>
-  <w:style w:type="table" w:styleId="45">
+  <w:style w:type="table" w:styleId="737">
     <w:name w:val="Grid Table 4 - Accent 5"/>
-    <w:basedOn w:val="11"/>
+    <w:basedOn w:val="703"/>
     <w:uiPriority w:val="59"/>
     <w:pPr>
       <w:pBdr/>
@@ -10173,9 +10098,9 @@
       </w:tcPr>
     </w:tblStylePr>
   </w:style>
-  <w:style w:type="table" w:styleId="46">
+  <w:style w:type="table" w:styleId="738">
     <w:name w:val="Grid Table 4 - Accent 6"/>
-    <w:basedOn w:val="11"/>
+    <w:basedOn w:val="703"/>
     <w:uiPriority w:val="59"/>
     <w:pPr>
       <w:pBdr/>
@@ -10406,9 +10331,9 @@
       </w:tcPr>
     </w:tblStylePr>
   </w:style>
-  <w:style w:type="table" w:styleId="47">
+  <w:style w:type="table" w:styleId="739">
     <w:name w:val="Grid Table 5 Dark"/>
-    <w:basedOn w:val="11"/>
+    <w:basedOn w:val="703"/>
     <w:uiPriority w:val="99"/>
     <w:pPr>
       <w:pBdr/>
@@ -10634,9 +10559,9 @@
       </w:tcPr>
     </w:tblStylePr>
   </w:style>
-  <w:style w:type="table" w:styleId="48">
+  <w:style w:type="table" w:styleId="740">
     <w:name w:val="Grid Table 5 Dark- Accent 1"/>
-    <w:basedOn w:val="11"/>
+    <w:basedOn w:val="703"/>
     <w:uiPriority w:val="99"/>
     <w:pPr>
       <w:pBdr/>
@@ -10862,9 +10787,9 @@
       </w:tcPr>
     </w:tblStylePr>
   </w:style>
-  <w:style w:type="table" w:styleId="49">
+  <w:style w:type="table" w:styleId="741">
     <w:name w:val="Grid Table 5 Dark - Accent 2"/>
-    <w:basedOn w:val="11"/>
+    <w:basedOn w:val="703"/>
     <w:uiPriority w:val="99"/>
     <w:pPr>
       <w:pBdr/>
@@ -11090,9 +11015,9 @@
       </w:tcPr>
     </w:tblStylePr>
   </w:style>
-  <w:style w:type="table" w:styleId="50">
+  <w:style w:type="table" w:styleId="742">
     <w:name w:val="Grid Table 5 Dark - Accent 3"/>
-    <w:basedOn w:val="11"/>
+    <w:basedOn w:val="703"/>
     <w:uiPriority w:val="99"/>
     <w:pPr>
       <w:pBdr/>
@@ -11318,9 +11243,9 @@
       </w:tcPr>
     </w:tblStylePr>
   </w:style>
-  <w:style w:type="table" w:styleId="51">
+  <w:style w:type="table" w:styleId="743">
     <w:name w:val="Grid Table 5 Dark- Accent 4"/>
-    <w:basedOn w:val="11"/>
+    <w:basedOn w:val="703"/>
     <w:uiPriority w:val="99"/>
     <w:pPr>
       <w:pBdr/>
@@ -11546,9 +11471,9 @@
       </w:tcPr>
     </w:tblStylePr>
   </w:style>
-  <w:style w:type="table" w:styleId="52">
+  <w:style w:type="table" w:styleId="744">
     <w:name w:val="Grid Table 5 Dark - Accent 5"/>
-    <w:basedOn w:val="11"/>
+    <w:basedOn w:val="703"/>
     <w:uiPriority w:val="99"/>
     <w:pPr>
       <w:pBdr/>
@@ -11774,9 +11699,9 @@
       </w:tcPr>
     </w:tblStylePr>
   </w:style>
-  <w:style w:type="table" w:styleId="53">
+  <w:style w:type="table" w:styleId="745">
     <w:name w:val="Grid Table 5 Dark - Accent 6"/>
-    <w:basedOn w:val="11"/>
+    <w:basedOn w:val="703"/>
     <w:uiPriority w:val="99"/>
     <w:pPr>
       <w:pBdr/>
@@ -12002,9 +11927,9 @@
       </w:tcPr>
     </w:tblStylePr>
   </w:style>
-  <w:style w:type="table" w:styleId="54">
+  <w:style w:type="table" w:styleId="746">
     <w:name w:val="Grid Table 6 Colorful"/>
-    <w:basedOn w:val="11"/>
+    <w:basedOn w:val="703"/>
     <w:uiPriority w:val="99"/>
     <w:pPr>
       <w:pBdr/>
@@ -12232,9 +12157,9 @@
       </w:tcPr>
     </w:tblStylePr>
   </w:style>
-  <w:style w:type="table" w:styleId="55">
+  <w:style w:type="table" w:styleId="747">
     <w:name w:val="Grid Table 6 Colorful - Accent 1"/>
-    <w:basedOn w:val="11"/>
+    <w:basedOn w:val="703"/>
     <w:uiPriority w:val="99"/>
     <w:pPr>
       <w:pBdr/>
@@ -12462,9 +12387,9 @@
       </w:tcPr>
     </w:tblStylePr>
   </w:style>
-  <w:style w:type="table" w:styleId="56">
+  <w:style w:type="table" w:styleId="748">
     <w:name w:val="Grid Table 6 Colorful - Accent 2"/>
-    <w:basedOn w:val="11"/>
+    <w:basedOn w:val="703"/>
     <w:uiPriority w:val="99"/>
     <w:pPr>
       <w:pBdr/>
@@ -12692,9 +12617,9 @@
       </w:tcPr>
     </w:tblStylePr>
   </w:style>
-  <w:style w:type="table" w:styleId="57">
+  <w:style w:type="table" w:styleId="749">
     <w:name w:val="Grid Table 6 Colorful - Accent 3"/>
-    <w:basedOn w:val="11"/>
+    <w:basedOn w:val="703"/>
     <w:uiPriority w:val="99"/>
     <w:pPr>
       <w:pBdr/>
@@ -12922,9 +12847,9 @@
       </w:tcPr>
     </w:tblStylePr>
   </w:style>
-  <w:style w:type="table" w:styleId="58">
+  <w:style w:type="table" w:styleId="750">
     <w:name w:val="Grid Table 6 Colorful - Accent 4"/>
-    <w:basedOn w:val="11"/>
+    <w:basedOn w:val="703"/>
     <w:uiPriority w:val="99"/>
     <w:pPr>
       <w:pBdr/>
@@ -13152,9 +13077,9 @@
       </w:tcPr>
     </w:tblStylePr>
   </w:style>
-  <w:style w:type="table" w:styleId="59">
+  <w:style w:type="table" w:styleId="751">
     <w:name w:val="Grid Table 6 Colorful - Accent 5"/>
-    <w:basedOn w:val="11"/>
+    <w:basedOn w:val="703"/>
     <w:uiPriority w:val="99"/>
     <w:pPr>
       <w:pBdr/>
@@ -13382,9 +13307,9 @@
       </w:tcPr>
     </w:tblStylePr>
   </w:style>
-  <w:style w:type="table" w:styleId="60">
+  <w:style w:type="table" w:styleId="752">
     <w:name w:val="Grid Table 6 Colorful - Accent 6"/>
-    <w:basedOn w:val="11"/>
+    <w:basedOn w:val="703"/>
     <w:uiPriority w:val="99"/>
     <w:pPr>
       <w:pBdr/>
@@ -13612,9 +13537,9 @@
       </w:tcPr>
     </w:tblStylePr>
   </w:style>
-  <w:style w:type="table" w:styleId="61">
+  <w:style w:type="table" w:styleId="753">
     <w:name w:val="Grid Table 7 Colorful"/>
-    <w:basedOn w:val="11"/>
+    <w:basedOn w:val="703"/>
     <w:uiPriority w:val="99"/>
     <w:pPr>
       <w:pBdr/>
@@ -13716,11 +13641,11 @@
         <w:tblBorders/>
       </w:tblPr>
       <w:tcPr>
-        <w:shd w:color="ffffff"/>
+        <w:shd w:val="clear" w:color="ffffff"/>
         <w:tcBorders>
-          <w:top w:val="none"/>
-          <w:left w:val="none"/>
-          <w:bottom w:val="none"/>
+          <w:top w:val="none" w:color="000000" w:sz="4" w:space="0"/>
+          <w:left w:val="none" w:color="000000" w:sz="4" w:space="0"/>
+          <w:bottom w:val="none" w:color="000000" w:sz="4" w:space="0"/>
           <w:right w:val="single" w:color="000000" w:themeColor="text1" w:themeTint="80" w:sz="4" w:space="0"/>
         </w:tcBorders>
       </w:tcPr>
@@ -13743,10 +13668,10 @@
       <w:tcPr>
         <w:shd w:val="clear" w:color="ffffff" w:themeColor="light1" w:fill="ffffff" w:themeFill="light1"/>
         <w:tcBorders>
-          <w:top w:val="none"/>
-          <w:left w:val="none"/>
+          <w:top w:val="none" w:color="000000" w:sz="4" w:space="0"/>
+          <w:left w:val="none" w:color="000000" w:sz="4" w:space="0"/>
           <w:bottom w:val="single" w:color="000000" w:themeColor="text1" w:themeTint="80" w:sz="4" w:space="0"/>
-          <w:right w:val="none"/>
+          <w:right w:val="none" w:color="000000" w:sz="4" w:space="0"/>
         </w:tcBorders>
       </w:tcPr>
     </w:tblStylePr>
@@ -13766,12 +13691,12 @@
         <w:tblBorders/>
       </w:tblPr>
       <w:tcPr>
-        <w:shd w:color="ffffff"/>
+        <w:shd w:val="clear" w:color="ffffff"/>
         <w:tcBorders>
-          <w:top w:val="none"/>
+          <w:top w:val="none" w:color="000000" w:sz="4" w:space="0"/>
           <w:left w:val="single" w:color="000000" w:themeColor="text1" w:themeTint="80" w:sz="4" w:space="0"/>
-          <w:bottom w:val="none"/>
-          <w:right w:val="none"/>
+          <w:bottom w:val="none" w:color="000000" w:sz="4" w:space="0"/>
+          <w:right w:val="none" w:color="000000" w:sz="4" w:space="0"/>
         </w:tcBorders>
       </w:tcPr>
     </w:tblStylePr>
@@ -13794,9 +13719,9 @@
         <w:shd w:val="clear" w:color="ffffff" w:themeColor="light1" w:fill="ffffff" w:themeFill="light1"/>
         <w:tcBorders>
           <w:top w:val="single" w:color="000000" w:themeColor="text1" w:themeTint="80" w:sz="4" w:space="0"/>
-          <w:left w:val="none"/>
-          <w:bottom w:val="none"/>
-          <w:right w:val="none"/>
+          <w:left w:val="none" w:color="000000" w:sz="4" w:space="0"/>
+          <w:bottom w:val="none" w:color="000000" w:sz="4" w:space="0"/>
+          <w:right w:val="none" w:color="000000" w:sz="4" w:space="0"/>
         </w:tcBorders>
       </w:tcPr>
     </w:tblStylePr>
@@ -13866,9 +13791,9 @@
       </w:tcPr>
     </w:tblStylePr>
   </w:style>
-  <w:style w:type="table" w:styleId="62">
+  <w:style w:type="table" w:styleId="754">
     <w:name w:val="Grid Table 7 Colorful - Accent 1"/>
-    <w:basedOn w:val="11"/>
+    <w:basedOn w:val="703"/>
     <w:uiPriority w:val="99"/>
     <w:pPr>
       <w:pBdr/>
@@ -13970,11 +13895,11 @@
         <w:tblBorders/>
       </w:tblPr>
       <w:tcPr>
-        <w:shd w:color="ffffff"/>
+        <w:shd w:val="clear" w:color="ffffff"/>
         <w:tcBorders>
-          <w:top w:val="none"/>
-          <w:left w:val="none"/>
-          <w:bottom w:val="none"/>
+          <w:top w:val="none" w:color="000000" w:sz="4" w:space="0"/>
+          <w:left w:val="none" w:color="000000" w:sz="4" w:space="0"/>
+          <w:bottom w:val="none" w:color="000000" w:sz="4" w:space="0"/>
           <w:right w:val="single" w:color="000000" w:themeColor="accent1" w:themeTint="80" w:sz="4" w:space="0"/>
         </w:tcBorders>
       </w:tcPr>
@@ -13997,10 +13922,10 @@
       <w:tcPr>
         <w:shd w:val="clear" w:color="ffffff" w:themeColor="light1" w:fill="ffffff" w:themeFill="light1"/>
         <w:tcBorders>
-          <w:top w:val="none"/>
-          <w:left w:val="none"/>
+          <w:top w:val="none" w:color="000000" w:sz="4" w:space="0"/>
+          <w:left w:val="none" w:color="000000" w:sz="4" w:space="0"/>
           <w:bottom w:val="single" w:color="000000" w:themeColor="accent1" w:themeTint="80" w:sz="4" w:space="0"/>
-          <w:right w:val="none"/>
+          <w:right w:val="none" w:color="000000" w:sz="4" w:space="0"/>
         </w:tcBorders>
       </w:tcPr>
     </w:tblStylePr>
@@ -14020,12 +13945,12 @@
         <w:tblBorders/>
       </w:tblPr>
       <w:tcPr>
-        <w:shd w:color="ffffff"/>
+        <w:shd w:val="clear" w:color="ffffff"/>
         <w:tcBorders>
-          <w:top w:val="none"/>
+          <w:top w:val="none" w:color="000000" w:sz="4" w:space="0"/>
           <w:left w:val="single" w:color="000000" w:themeColor="accent1" w:themeTint="80" w:sz="4" w:space="0"/>
-          <w:bottom w:val="none"/>
-          <w:right w:val="none"/>
+          <w:bottom w:val="none" w:color="000000" w:sz="4" w:space="0"/>
+          <w:right w:val="none" w:color="000000" w:sz="4" w:space="0"/>
         </w:tcBorders>
       </w:tcPr>
     </w:tblStylePr>
@@ -14048,9 +13973,9 @@
         <w:shd w:val="clear" w:color="ffffff" w:themeColor="light1" w:fill="ffffff" w:themeFill="light1"/>
         <w:tcBorders>
           <w:top w:val="single" w:color="000000" w:themeColor="accent1" w:themeTint="80" w:sz="4" w:space="0"/>
-          <w:left w:val="none"/>
-          <w:bottom w:val="none"/>
-          <w:right w:val="none"/>
+          <w:left w:val="none" w:color="000000" w:sz="4" w:space="0"/>
+          <w:bottom w:val="none" w:color="000000" w:sz="4" w:space="0"/>
+          <w:right w:val="none" w:color="000000" w:sz="4" w:space="0"/>
         </w:tcBorders>
       </w:tcPr>
     </w:tblStylePr>
@@ -14120,9 +14045,9 @@
       </w:tcPr>
     </w:tblStylePr>
   </w:style>
-  <w:style w:type="table" w:styleId="63">
+  <w:style w:type="table" w:styleId="755">
     <w:name w:val="Grid Table 7 Colorful - Accent 2"/>
-    <w:basedOn w:val="11"/>
+    <w:basedOn w:val="703"/>
     <w:uiPriority w:val="99"/>
     <w:pPr>
       <w:pBdr/>
@@ -14224,11 +14149,11 @@
         <w:tblBorders/>
       </w:tblPr>
       <w:tcPr>
-        <w:shd w:color="ffffff"/>
+        <w:shd w:val="clear" w:color="ffffff"/>
         <w:tcBorders>
-          <w:top w:val="none"/>
-          <w:left w:val="none"/>
-          <w:bottom w:val="none"/>
+          <w:top w:val="none" w:color="000000" w:sz="4" w:space="0"/>
+          <w:left w:val="none" w:color="000000" w:sz="4" w:space="0"/>
+          <w:bottom w:val="none" w:color="000000" w:sz="4" w:space="0"/>
           <w:right w:val="single" w:color="000000" w:themeColor="accent2" w:themeTint="97" w:sz="4" w:space="0"/>
         </w:tcBorders>
       </w:tcPr>
@@ -14251,10 +14176,10 @@
       <w:tcPr>
         <w:shd w:val="clear" w:color="ffffff" w:themeColor="light1" w:fill="ffffff" w:themeFill="light1"/>
         <w:tcBorders>
-          <w:top w:val="none"/>
-          <w:left w:val="none"/>
+          <w:top w:val="none" w:color="000000" w:sz="4" w:space="0"/>
+          <w:left w:val="none" w:color="000000" w:sz="4" w:space="0"/>
           <w:bottom w:val="single" w:color="000000" w:themeColor="accent2" w:themeTint="97" w:sz="4" w:space="0"/>
-          <w:right w:val="none"/>
+          <w:right w:val="none" w:color="000000" w:sz="4" w:space="0"/>
         </w:tcBorders>
       </w:tcPr>
     </w:tblStylePr>
@@ -14274,12 +14199,12 @@
         <w:tblBorders/>
       </w:tblPr>
       <w:tcPr>
-        <w:shd w:color="ffffff"/>
+        <w:shd w:val="clear" w:color="ffffff"/>
         <w:tcBorders>
-          <w:top w:val="none"/>
+          <w:top w:val="none" w:color="000000" w:sz="4" w:space="0"/>
           <w:left w:val="single" w:color="000000" w:themeColor="accent2" w:themeTint="97" w:sz="4" w:space="0"/>
-          <w:bottom w:val="none"/>
-          <w:right w:val="none"/>
+          <w:bottom w:val="none" w:color="000000" w:sz="4" w:space="0"/>
+          <w:right w:val="none" w:color="000000" w:sz="4" w:space="0"/>
         </w:tcBorders>
       </w:tcPr>
     </w:tblStylePr>
@@ -14302,9 +14227,9 @@
         <w:shd w:val="clear" w:color="ffffff" w:themeColor="light1" w:fill="ffffff" w:themeFill="light1"/>
         <w:tcBorders>
           <w:top w:val="single" w:color="000000" w:themeColor="accent2" w:themeTint="97" w:sz="4" w:space="0"/>
-          <w:left w:val="none"/>
-          <w:bottom w:val="none"/>
-          <w:right w:val="none"/>
+          <w:left w:val="none" w:color="000000" w:sz="4" w:space="0"/>
+          <w:bottom w:val="none" w:color="000000" w:sz="4" w:space="0"/>
+          <w:right w:val="none" w:color="000000" w:sz="4" w:space="0"/>
         </w:tcBorders>
       </w:tcPr>
     </w:tblStylePr>
@@ -14374,9 +14299,9 @@
       </w:tcPr>
     </w:tblStylePr>
   </w:style>
-  <w:style w:type="table" w:styleId="64">
+  <w:style w:type="table" w:styleId="756">
     <w:name w:val="Grid Table 7 Colorful - Accent 3"/>
-    <w:basedOn w:val="11"/>
+    <w:basedOn w:val="703"/>
     <w:uiPriority w:val="99"/>
     <w:pPr>
       <w:pBdr/>
@@ -14478,11 +14403,11 @@
         <w:tblBorders/>
       </w:tblPr>
       <w:tcPr>
-        <w:shd w:color="ffffff"/>
+        <w:shd w:val="clear" w:color="ffffff"/>
         <w:tcBorders>
-          <w:top w:val="none"/>
-          <w:left w:val="none"/>
-          <w:bottom w:val="none"/>
+          <w:top w:val="none" w:color="000000" w:sz="4" w:space="0"/>
+          <w:left w:val="none" w:color="000000" w:sz="4" w:space="0"/>
+          <w:bottom w:val="none" w:color="000000" w:sz="4" w:space="0"/>
           <w:right w:val="single" w:color="000000" w:themeColor="accent3" w:themeTint="FE" w:sz="4" w:space="0"/>
         </w:tcBorders>
       </w:tcPr>
@@ -14505,10 +14430,10 @@
       <w:tcPr>
         <w:shd w:val="clear" w:color="ffffff" w:themeColor="light1" w:fill="ffffff" w:themeFill="light1"/>
         <w:tcBorders>
-          <w:top w:val="none"/>
-          <w:left w:val="none"/>
+          <w:top w:val="none" w:color="000000" w:sz="4" w:space="0"/>
+          <w:left w:val="none" w:color="000000" w:sz="4" w:space="0"/>
           <w:bottom w:val="single" w:color="000000" w:themeColor="accent3" w:themeTint="FE" w:sz="4" w:space="0"/>
-          <w:right w:val="none"/>
+          <w:right w:val="none" w:color="000000" w:sz="4" w:space="0"/>
         </w:tcBorders>
       </w:tcPr>
     </w:tblStylePr>
@@ -14528,12 +14453,12 @@
         <w:tblBorders/>
       </w:tblPr>
       <w:tcPr>
-        <w:shd w:color="ffffff"/>
+        <w:shd w:val="clear" w:color="ffffff"/>
         <w:tcBorders>
-          <w:top w:val="none"/>
+          <w:top w:val="none" w:color="000000" w:sz="4" w:space="0"/>
           <w:left w:val="single" w:color="000000" w:themeColor="accent3" w:themeTint="FE" w:sz="4" w:space="0"/>
-          <w:bottom w:val="none"/>
-          <w:right w:val="none"/>
+          <w:bottom w:val="none" w:color="000000" w:sz="4" w:space="0"/>
+          <w:right w:val="none" w:color="000000" w:sz="4" w:space="0"/>
         </w:tcBorders>
       </w:tcPr>
     </w:tblStylePr>
@@ -14556,9 +14481,9 @@
         <w:shd w:val="clear" w:color="ffffff" w:themeColor="light1" w:fill="ffffff" w:themeFill="light1"/>
         <w:tcBorders>
           <w:top w:val="single" w:color="000000" w:themeColor="accent3" w:themeTint="FE" w:sz="4" w:space="0"/>
-          <w:left w:val="none"/>
-          <w:bottom w:val="none"/>
-          <w:right w:val="none"/>
+          <w:left w:val="none" w:color="000000" w:sz="4" w:space="0"/>
+          <w:bottom w:val="none" w:color="000000" w:sz="4" w:space="0"/>
+          <w:right w:val="none" w:color="000000" w:sz="4" w:space="0"/>
         </w:tcBorders>
       </w:tcPr>
     </w:tblStylePr>
@@ -14628,9 +14553,9 @@
       </w:tcPr>
     </w:tblStylePr>
   </w:style>
-  <w:style w:type="table" w:styleId="65">
+  <w:style w:type="table" w:styleId="757">
     <w:name w:val="Grid Table 7 Colorful - Accent 4"/>
-    <w:basedOn w:val="11"/>
+    <w:basedOn w:val="703"/>
     <w:uiPriority w:val="99"/>
     <w:pPr>
       <w:pBdr/>
@@ -14732,11 +14657,11 @@
         <w:tblBorders/>
       </w:tblPr>
       <w:tcPr>
-        <w:shd w:color="ffffff"/>
+        <w:shd w:val="clear" w:color="ffffff"/>
         <w:tcBorders>
-          <w:top w:val="none"/>
-          <w:left w:val="none"/>
-          <w:bottom w:val="none"/>
+          <w:top w:val="none" w:color="000000" w:sz="4" w:space="0"/>
+          <w:left w:val="none" w:color="000000" w:sz="4" w:space="0"/>
+          <w:bottom w:val="none" w:color="000000" w:sz="4" w:space="0"/>
           <w:right w:val="single" w:color="000000" w:themeColor="accent4" w:themeTint="9A" w:sz="4" w:space="0"/>
         </w:tcBorders>
       </w:tcPr>
@@ -14759,10 +14684,10 @@
       <w:tcPr>
         <w:shd w:val="clear" w:color="ffffff" w:themeColor="light1" w:fill="ffffff" w:themeFill="light1"/>
         <w:tcBorders>
-          <w:top w:val="none"/>
-          <w:left w:val="none"/>
+          <w:top w:val="none" w:color="000000" w:sz="4" w:space="0"/>
+          <w:left w:val="none" w:color="000000" w:sz="4" w:space="0"/>
           <w:bottom w:val="single" w:color="000000" w:themeColor="accent4" w:themeTint="9A" w:sz="4" w:space="0"/>
-          <w:right w:val="none"/>
+          <w:right w:val="none" w:color="000000" w:sz="4" w:space="0"/>
         </w:tcBorders>
       </w:tcPr>
     </w:tblStylePr>
@@ -14782,12 +14707,12 @@
         <w:tblBorders/>
       </w:tblPr>
       <w:tcPr>
-        <w:shd w:color="ffffff"/>
+        <w:shd w:val="clear" w:color="ffffff"/>
         <w:tcBorders>
-          <w:top w:val="none"/>
+          <w:top w:val="none" w:color="000000" w:sz="4" w:space="0"/>
           <w:left w:val="single" w:color="000000" w:themeColor="accent4" w:themeTint="9A" w:sz="4" w:space="0"/>
-          <w:bottom w:val="none"/>
-          <w:right w:val="none"/>
+          <w:bottom w:val="none" w:color="000000" w:sz="4" w:space="0"/>
+          <w:right w:val="none" w:color="000000" w:sz="4" w:space="0"/>
         </w:tcBorders>
       </w:tcPr>
     </w:tblStylePr>
@@ -14810,9 +14735,9 @@
         <w:shd w:val="clear" w:color="ffffff" w:themeColor="light1" w:fill="ffffff" w:themeFill="light1"/>
         <w:tcBorders>
           <w:top w:val="single" w:color="000000" w:themeColor="accent4" w:themeTint="9A" w:sz="4" w:space="0"/>
-          <w:left w:val="none"/>
-          <w:bottom w:val="none"/>
-          <w:right w:val="none"/>
+          <w:left w:val="none" w:color="000000" w:sz="4" w:space="0"/>
+          <w:bottom w:val="none" w:color="000000" w:sz="4" w:space="0"/>
+          <w:right w:val="none" w:color="000000" w:sz="4" w:space="0"/>
         </w:tcBorders>
       </w:tcPr>
     </w:tblStylePr>
@@ -14882,9 +14807,9 @@
       </w:tcPr>
     </w:tblStylePr>
   </w:style>
-  <w:style w:type="table" w:styleId="66">
+  <w:style w:type="table" w:styleId="758">
     <w:name w:val="Grid Table 7 Colorful - Accent 5"/>
-    <w:basedOn w:val="11"/>
+    <w:basedOn w:val="703"/>
     <w:uiPriority w:val="99"/>
     <w:pPr>
       <w:pBdr/>
@@ -14986,11 +14911,11 @@
         <w:tblBorders/>
       </w:tblPr>
       <w:tcPr>
-        <w:shd w:color="ffffff"/>
+        <w:shd w:val="clear" w:color="ffffff"/>
         <w:tcBorders>
-          <w:top w:val="none"/>
-          <w:left w:val="none"/>
-          <w:bottom w:val="none"/>
+          <w:top w:val="none" w:color="000000" w:sz="4" w:space="0"/>
+          <w:left w:val="none" w:color="000000" w:sz="4" w:space="0"/>
+          <w:bottom w:val="none" w:color="000000" w:sz="4" w:space="0"/>
           <w:right w:val="single" w:color="000000" w:themeColor="accent5" w:themeTint="90" w:sz="4" w:space="0"/>
         </w:tcBorders>
       </w:tcPr>
@@ -15013,10 +14938,10 @@
       <w:tcPr>
         <w:shd w:val="clear" w:color="ffffff" w:themeColor="light1" w:fill="ffffff" w:themeFill="light1"/>
         <w:tcBorders>
-          <w:top w:val="none"/>
-          <w:left w:val="none"/>
+          <w:top w:val="none" w:color="000000" w:sz="4" w:space="0"/>
+          <w:left w:val="none" w:color="000000" w:sz="4" w:space="0"/>
           <w:bottom w:val="single" w:color="000000" w:themeColor="accent5" w:themeTint="90" w:sz="4" w:space="0"/>
-          <w:right w:val="none"/>
+          <w:right w:val="none" w:color="000000" w:sz="4" w:space="0"/>
         </w:tcBorders>
       </w:tcPr>
     </w:tblStylePr>
@@ -15036,12 +14961,12 @@
         <w:tblBorders/>
       </w:tblPr>
       <w:tcPr>
-        <w:shd w:color="ffffff"/>
+        <w:shd w:val="clear" w:color="ffffff"/>
         <w:tcBorders>
-          <w:top w:val="none"/>
+          <w:top w:val="none" w:color="000000" w:sz="4" w:space="0"/>
           <w:left w:val="single" w:color="000000" w:themeColor="accent5" w:themeTint="90" w:sz="4" w:space="0"/>
-          <w:bottom w:val="none"/>
-          <w:right w:val="none"/>
+          <w:bottom w:val="none" w:color="000000" w:sz="4" w:space="0"/>
+          <w:right w:val="none" w:color="000000" w:sz="4" w:space="0"/>
         </w:tcBorders>
       </w:tcPr>
     </w:tblStylePr>
@@ -15064,9 +14989,9 @@
         <w:shd w:val="clear" w:color="ffffff" w:themeColor="light1" w:fill="ffffff" w:themeFill="light1"/>
         <w:tcBorders>
           <w:top w:val="single" w:color="000000" w:themeColor="accent5" w:themeTint="90" w:sz="4" w:space="0"/>
-          <w:left w:val="none"/>
-          <w:bottom w:val="none"/>
-          <w:right w:val="none"/>
+          <w:left w:val="none" w:color="000000" w:sz="4" w:space="0"/>
+          <w:bottom w:val="none" w:color="000000" w:sz="4" w:space="0"/>
+          <w:right w:val="none" w:color="000000" w:sz="4" w:space="0"/>
         </w:tcBorders>
       </w:tcPr>
     </w:tblStylePr>
@@ -15136,9 +15061,9 @@
       </w:tcPr>
     </w:tblStylePr>
   </w:style>
-  <w:style w:type="table" w:styleId="67">
+  <w:style w:type="table" w:styleId="759">
     <w:name w:val="Grid Table 7 Colorful - Accent 6"/>
-    <w:basedOn w:val="11"/>
+    <w:basedOn w:val="703"/>
     <w:uiPriority w:val="99"/>
     <w:pPr>
       <w:pBdr/>
@@ -15240,11 +15165,11 @@
         <w:tblBorders/>
       </w:tblPr>
       <w:tcPr>
-        <w:shd w:color="ffffff"/>
+        <w:shd w:val="clear" w:color="ffffff"/>
         <w:tcBorders>
-          <w:top w:val="none"/>
-          <w:left w:val="none"/>
-          <w:bottom w:val="none"/>
+          <w:top w:val="none" w:color="000000" w:sz="4" w:space="0"/>
+          <w:left w:val="none" w:color="000000" w:sz="4" w:space="0"/>
+          <w:bottom w:val="none" w:color="000000" w:sz="4" w:space="0"/>
           <w:right w:val="single" w:color="000000" w:themeColor="accent6" w:themeTint="90" w:sz="4" w:space="0"/>
         </w:tcBorders>
       </w:tcPr>
@@ -15267,10 +15192,10 @@
       <w:tcPr>
         <w:shd w:val="clear" w:color="ffffff" w:themeColor="light1" w:fill="ffffff" w:themeFill="light1"/>
         <w:tcBorders>
-          <w:top w:val="none"/>
-          <w:left w:val="none"/>
+          <w:top w:val="none" w:color="000000" w:sz="4" w:space="0"/>
+          <w:left w:val="none" w:color="000000" w:sz="4" w:space="0"/>
           <w:bottom w:val="single" w:color="000000" w:themeColor="accent6" w:themeTint="90" w:sz="4" w:space="0"/>
-          <w:right w:val="none"/>
+          <w:right w:val="none" w:color="000000" w:sz="4" w:space="0"/>
         </w:tcBorders>
       </w:tcPr>
     </w:tblStylePr>
@@ -15290,12 +15215,12 @@
         <w:tblBorders/>
       </w:tblPr>
       <w:tcPr>
-        <w:shd w:color="ffffff"/>
+        <w:shd w:val="clear" w:color="ffffff"/>
         <w:tcBorders>
-          <w:top w:val="none"/>
+          <w:top w:val="none" w:color="000000" w:sz="4" w:space="0"/>
           <w:left w:val="single" w:color="000000" w:themeColor="accent6" w:themeTint="90" w:sz="4" w:space="0"/>
-          <w:bottom w:val="none"/>
-          <w:right w:val="none"/>
+          <w:bottom w:val="none" w:color="000000" w:sz="4" w:space="0"/>
+          <w:right w:val="none" w:color="000000" w:sz="4" w:space="0"/>
         </w:tcBorders>
       </w:tcPr>
     </w:tblStylePr>
@@ -15318,9 +15243,9 @@
         <w:shd w:val="clear" w:color="ffffff" w:themeColor="light1" w:fill="ffffff" w:themeFill="light1"/>
         <w:tcBorders>
           <w:top w:val="single" w:color="000000" w:themeColor="accent6" w:themeTint="90" w:sz="4" w:space="0"/>
-          <w:left w:val="none"/>
-          <w:bottom w:val="none"/>
-          <w:right w:val="none"/>
+          <w:left w:val="none" w:color="000000" w:sz="4" w:space="0"/>
+          <w:bottom w:val="none" w:color="000000" w:sz="4" w:space="0"/>
+          <w:right w:val="none" w:color="000000" w:sz="4" w:space="0"/>
         </w:tcBorders>
       </w:tcPr>
     </w:tblStylePr>
@@ -15390,9 +15315,9 @@
       </w:tcPr>
     </w:tblStylePr>
   </w:style>
-  <w:style w:type="table" w:styleId="68">
+  <w:style w:type="table" w:styleId="760">
     <w:name w:val="List Table 1 Light"/>
-    <w:basedOn w:val="11"/>
+    <w:basedOn w:val="703"/>
     <w:uiPriority w:val="99"/>
     <w:pPr>
       <w:pBdr/>
@@ -15606,9 +15531,9 @@
       </w:tcPr>
     </w:tblStylePr>
   </w:style>
-  <w:style w:type="table" w:styleId="69">
+  <w:style w:type="table" w:styleId="761">
     <w:name w:val="List Table 1 Light - Accent 1"/>
-    <w:basedOn w:val="11"/>
+    <w:basedOn w:val="703"/>
     <w:uiPriority w:val="99"/>
     <w:pPr>
       <w:pBdr/>
@@ -15822,9 +15747,9 @@
       </w:tcPr>
     </w:tblStylePr>
   </w:style>
-  <w:style w:type="table" w:styleId="70">
+  <w:style w:type="table" w:styleId="762">
     <w:name w:val="List Table 1 Light - Accent 2"/>
-    <w:basedOn w:val="11"/>
+    <w:basedOn w:val="703"/>
     <w:uiPriority w:val="99"/>
     <w:pPr>
       <w:pBdr/>
@@ -16038,9 +15963,9 @@
       </w:tcPr>
     </w:tblStylePr>
   </w:style>
-  <w:style w:type="table" w:styleId="71">
+  <w:style w:type="table" w:styleId="763">
     <w:name w:val="List Table 1 Light - Accent 3"/>
-    <w:basedOn w:val="11"/>
+    <w:basedOn w:val="703"/>
     <w:uiPriority w:val="99"/>
     <w:pPr>
       <w:pBdr/>
@@ -16254,9 +16179,9 @@
       </w:tcPr>
     </w:tblStylePr>
   </w:style>
-  <w:style w:type="table" w:styleId="72">
+  <w:style w:type="table" w:styleId="764">
     <w:name w:val="List Table 1 Light - Accent 4"/>
-    <w:basedOn w:val="11"/>
+    <w:basedOn w:val="703"/>
     <w:uiPriority w:val="99"/>
     <w:pPr>
       <w:pBdr/>
@@ -16470,9 +16395,9 @@
       </w:tcPr>
     </w:tblStylePr>
   </w:style>
-  <w:style w:type="table" w:styleId="73">
+  <w:style w:type="table" w:styleId="765">
     <w:name w:val="List Table 1 Light - Accent 5"/>
-    <w:basedOn w:val="11"/>
+    <w:basedOn w:val="703"/>
     <w:uiPriority w:val="99"/>
     <w:pPr>
       <w:pBdr/>
@@ -16686,9 +16611,9 @@
       </w:tcPr>
     </w:tblStylePr>
   </w:style>
-  <w:style w:type="table" w:styleId="74">
+  <w:style w:type="table" w:styleId="766">
     <w:name w:val="List Table 1 Light - Accent 6"/>
-    <w:basedOn w:val="11"/>
+    <w:basedOn w:val="703"/>
     <w:uiPriority w:val="99"/>
     <w:pPr>
       <w:pBdr/>
@@ -16902,9 +16827,9 @@
       </w:tcPr>
     </w:tblStylePr>
   </w:style>
-  <w:style w:type="table" w:styleId="75">
+  <w:style w:type="table" w:styleId="767">
     <w:name w:val="List Table 2"/>
-    <w:basedOn w:val="11"/>
+    <w:basedOn w:val="703"/>
     <w:uiPriority w:val="99"/>
     <w:pPr>
       <w:pBdr/>
@@ -17140,9 +17065,9 @@
       </w:tcPr>
     </w:tblStylePr>
   </w:style>
-  <w:style w:type="table" w:styleId="76">
+  <w:style w:type="table" w:styleId="768">
     <w:name w:val="List Table 2 - Accent 1"/>
-    <w:basedOn w:val="11"/>
+    <w:basedOn w:val="703"/>
     <w:uiPriority w:val="99"/>
     <w:pPr>
       <w:pBdr/>
@@ -17378,9 +17303,9 @@
       </w:tcPr>
     </w:tblStylePr>
   </w:style>
-  <w:style w:type="table" w:styleId="77">
+  <w:style w:type="table" w:styleId="769">
     <w:name w:val="List Table 2 - Accent 2"/>
-    <w:basedOn w:val="11"/>
+    <w:basedOn w:val="703"/>
     <w:uiPriority w:val="99"/>
     <w:pPr>
       <w:pBdr/>
@@ -17616,9 +17541,9 @@
       </w:tcPr>
     </w:tblStylePr>
   </w:style>
-  <w:style w:type="table" w:styleId="78">
+  <w:style w:type="table" w:styleId="770">
     <w:name w:val="List Table 2 - Accent 3"/>
-    <w:basedOn w:val="11"/>
+    <w:basedOn w:val="703"/>
     <w:uiPriority w:val="99"/>
     <w:pPr>
       <w:pBdr/>
@@ -17854,9 +17779,9 @@
       </w:tcPr>
     </w:tblStylePr>
   </w:style>
-  <w:style w:type="table" w:styleId="79">
+  <w:style w:type="table" w:styleId="771">
     <w:name w:val="List Table 2 - Accent 4"/>
-    <w:basedOn w:val="11"/>
+    <w:basedOn w:val="703"/>
     <w:uiPriority w:val="99"/>
     <w:pPr>
       <w:pBdr/>
@@ -18092,9 +18017,9 @@
       </w:tcPr>
     </w:tblStylePr>
   </w:style>
-  <w:style w:type="table" w:styleId="80">
+  <w:style w:type="table" w:styleId="772">
     <w:name w:val="List Table 2 - Accent 5"/>
-    <w:basedOn w:val="11"/>
+    <w:basedOn w:val="703"/>
     <w:uiPriority w:val="99"/>
     <w:pPr>
       <w:pBdr/>
@@ -18330,9 +18255,9 @@
       </w:tcPr>
     </w:tblStylePr>
   </w:style>
-  <w:style w:type="table" w:styleId="81">
+  <w:style w:type="table" w:styleId="773">
     <w:name w:val="List Table 2 - Accent 6"/>
-    <w:basedOn w:val="11"/>
+    <w:basedOn w:val="703"/>
     <w:uiPriority w:val="99"/>
     <w:pPr>
       <w:pBdr/>
@@ -18568,9 +18493,9 @@
       </w:tcPr>
     </w:tblStylePr>
   </w:style>
-  <w:style w:type="table" w:styleId="82">
+  <w:style w:type="table" w:styleId="774">
     <w:name w:val="List Table 3"/>
-    <w:basedOn w:val="11"/>
+    <w:basedOn w:val="703"/>
     <w:uiPriority w:val="99"/>
     <w:pPr>
       <w:pBdr/>
@@ -18796,9 +18721,9 @@
       </w:tcPr>
     </w:tblStylePr>
   </w:style>
-  <w:style w:type="table" w:styleId="83">
+  <w:style w:type="table" w:styleId="775">
     <w:name w:val="List Table 3 - Accent 1"/>
-    <w:basedOn w:val="11"/>
+    <w:basedOn w:val="703"/>
     <w:uiPriority w:val="99"/>
     <w:pPr>
       <w:pBdr/>
@@ -19024,9 +18949,9 @@
       </w:tcPr>
     </w:tblStylePr>
   </w:style>
-  <w:style w:type="table" w:styleId="84">
+  <w:style w:type="table" w:styleId="776">
     <w:name w:val="List Table 3 - Accent 2"/>
-    <w:basedOn w:val="11"/>
+    <w:basedOn w:val="703"/>
     <w:uiPriority w:val="99"/>
     <w:pPr>
       <w:pBdr/>
@@ -19252,9 +19177,9 @@
       </w:tcPr>
     </w:tblStylePr>
   </w:style>
-  <w:style w:type="table" w:styleId="85">
+  <w:style w:type="table" w:styleId="777">
     <w:name w:val="List Table 3 - Accent 3"/>
-    <w:basedOn w:val="11"/>
+    <w:basedOn w:val="703"/>
     <w:uiPriority w:val="99"/>
     <w:pPr>
       <w:pBdr/>
@@ -19480,9 +19405,9 @@
       </w:tcPr>
     </w:tblStylePr>
   </w:style>
-  <w:style w:type="table" w:styleId="86">
+  <w:style w:type="table" w:styleId="778">
     <w:name w:val="List Table 3 - Accent 4"/>
-    <w:basedOn w:val="11"/>
+    <w:basedOn w:val="703"/>
     <w:uiPriority w:val="99"/>
     <w:pPr>
       <w:pBdr/>
@@ -19708,9 +19633,9 @@
       </w:tcPr>
     </w:tblStylePr>
   </w:style>
-  <w:style w:type="table" w:styleId="87">
+  <w:style w:type="table" w:styleId="779">
     <w:name w:val="List Table 3 - Accent 5"/>
-    <w:basedOn w:val="11"/>
+    <w:basedOn w:val="703"/>
     <w:uiPriority w:val="99"/>
     <w:pPr>
       <w:pBdr/>
@@ -19936,9 +19861,9 @@
       </w:tcPr>
     </w:tblStylePr>
   </w:style>
-  <w:style w:type="table" w:styleId="88">
+  <w:style w:type="table" w:styleId="780">
     <w:name w:val="List Table 3 - Accent 6"/>
-    <w:basedOn w:val="11"/>
+    <w:basedOn w:val="703"/>
     <w:uiPriority w:val="99"/>
     <w:pPr>
       <w:pBdr/>
@@ -20164,9 +20089,9 @@
       </w:tcPr>
     </w:tblStylePr>
   </w:style>
-  <w:style w:type="table" w:styleId="89">
+  <w:style w:type="table" w:styleId="781">
     <w:name w:val="List Table 4"/>
-    <w:basedOn w:val="11"/>
+    <w:basedOn w:val="703"/>
     <w:uiPriority w:val="99"/>
     <w:pPr>
       <w:pBdr/>
@@ -20389,9 +20314,9 @@
       </w:tcPr>
     </w:tblStylePr>
   </w:style>
-  <w:style w:type="table" w:styleId="90">
+  <w:style w:type="table" w:styleId="782">
     <w:name w:val="List Table 4 - Accent 1"/>
-    <w:basedOn w:val="11"/>
+    <w:basedOn w:val="703"/>
     <w:uiPriority w:val="99"/>
     <w:pPr>
       <w:pBdr/>
@@ -20614,9 +20539,9 @@
       </w:tcPr>
     </w:tblStylePr>
   </w:style>
-  <w:style w:type="table" w:styleId="91">
+  <w:style w:type="table" w:styleId="783">
     <w:name w:val="List Table 4 - Accent 2"/>
-    <w:basedOn w:val="11"/>
+    <w:basedOn w:val="703"/>
     <w:uiPriority w:val="99"/>
     <w:pPr>
       <w:pBdr/>
@@ -20839,9 +20764,9 @@
       </w:tcPr>
     </w:tblStylePr>
   </w:style>
-  <w:style w:type="table" w:styleId="92">
+  <w:style w:type="table" w:styleId="784">
     <w:name w:val="List Table 4 - Accent 3"/>
-    <w:basedOn w:val="11"/>
+    <w:basedOn w:val="703"/>
     <w:uiPriority w:val="99"/>
     <w:pPr>
       <w:pBdr/>
@@ -21064,9 +20989,9 @@
       </w:tcPr>
     </w:tblStylePr>
   </w:style>
-  <w:style w:type="table" w:styleId="93">
+  <w:style w:type="table" w:styleId="785">
     <w:name w:val="List Table 4 - Accent 4"/>
-    <w:basedOn w:val="11"/>
+    <w:basedOn w:val="703"/>
     <w:uiPriority w:val="99"/>
     <w:pPr>
       <w:pBdr/>
@@ -21289,9 +21214,9 @@
       </w:tcPr>
     </w:tblStylePr>
   </w:style>
-  <w:style w:type="table" w:styleId="94">
+  <w:style w:type="table" w:styleId="786">
     <w:name w:val="List Table 4 - Accent 5"/>
-    <w:basedOn w:val="11"/>
+    <w:basedOn w:val="703"/>
     <w:uiPriority w:val="99"/>
     <w:pPr>
       <w:pBdr/>
@@ -21514,9 +21439,9 @@
       </w:tcPr>
     </w:tblStylePr>
   </w:style>
-  <w:style w:type="table" w:styleId="95">
+  <w:style w:type="table" w:styleId="787">
     <w:name w:val="List Table 4 - Accent 6"/>
-    <w:basedOn w:val="11"/>
+    <w:basedOn w:val="703"/>
     <w:uiPriority w:val="99"/>
     <w:pPr>
       <w:pBdr/>
@@ -21739,9 +21664,9 @@
       </w:tcPr>
     </w:tblStylePr>
   </w:style>
-  <w:style w:type="table" w:styleId="96">
+  <w:style w:type="table" w:styleId="788">
     <w:name w:val="List Table 5 Dark"/>
-    <w:basedOn w:val="11"/>
+    <w:basedOn w:val="703"/>
     <w:uiPriority w:val="99"/>
     <w:pPr>
       <w:pBdr/>
@@ -21981,9 +21906,9 @@
       </w:tcPr>
     </w:tblStylePr>
   </w:style>
-  <w:style w:type="table" w:styleId="97">
+  <w:style w:type="table" w:styleId="789">
     <w:name w:val="List Table 5 Dark - Accent 1"/>
-    <w:basedOn w:val="11"/>
+    <w:basedOn w:val="703"/>
     <w:uiPriority w:val="99"/>
     <w:pPr>
       <w:pBdr/>
@@ -22223,9 +22148,9 @@
       </w:tcPr>
     </w:tblStylePr>
   </w:style>
-  <w:style w:type="table" w:styleId="98">
+  <w:style w:type="table" w:styleId="790">
     <w:name w:val="List Table 5 Dark - Accent 2"/>
-    <w:basedOn w:val="11"/>
+    <w:basedOn w:val="703"/>
     <w:uiPriority w:val="99"/>
     <w:pPr>
       <w:pBdr/>
@@ -22465,9 +22390,9 @@
       </w:tcPr>
     </w:tblStylePr>
   </w:style>
-  <w:style w:type="table" w:styleId="99">
+  <w:style w:type="table" w:styleId="791">
     <w:name w:val="List Table 5 Dark - Accent 3"/>
-    <w:basedOn w:val="11"/>
+    <w:basedOn w:val="703"/>
     <w:uiPriority w:val="99"/>
     <w:pPr>
       <w:pBdr/>
@@ -22707,9 +22632,9 @@
       </w:tcPr>
     </w:tblStylePr>
   </w:style>
-  <w:style w:type="table" w:styleId="100">
+  <w:style w:type="table" w:styleId="792">
     <w:name w:val="List Table 5 Dark - Accent 4"/>
-    <w:basedOn w:val="11"/>
+    <w:basedOn w:val="703"/>
     <w:uiPriority w:val="99"/>
     <w:pPr>
       <w:pBdr/>
@@ -22949,9 +22874,9 @@
       </w:tcPr>
     </w:tblStylePr>
   </w:style>
-  <w:style w:type="table" w:styleId="101">
+  <w:style w:type="table" w:styleId="793">
     <w:name w:val="List Table 5 Dark - Accent 5"/>
-    <w:basedOn w:val="11"/>
+    <w:basedOn w:val="703"/>
     <w:uiPriority w:val="99"/>
     <w:pPr>
       <w:pBdr/>
@@ -23191,9 +23116,9 @@
       </w:tcPr>
     </w:tblStylePr>
   </w:style>
-  <w:style w:type="table" w:styleId="102">
+  <w:style w:type="table" w:styleId="794">
     <w:name w:val="List Table 5 Dark - Accent 6"/>
-    <w:basedOn w:val="11"/>
+    <w:basedOn w:val="703"/>
     <w:uiPriority w:val="99"/>
     <w:pPr>
       <w:pBdr/>
@@ -23433,9 +23358,9 @@
       </w:tcPr>
     </w:tblStylePr>
   </w:style>
-  <w:style w:type="table" w:styleId="103">
+  <w:style w:type="table" w:styleId="795">
     <w:name w:val="List Table 6 Colorful"/>
-    <w:basedOn w:val="11"/>
+    <w:basedOn w:val="703"/>
     <w:uiPriority w:val="99"/>
     <w:pPr>
       <w:pBdr/>
@@ -23656,9 +23581,9 @@
       </w:tcPr>
     </w:tblStylePr>
   </w:style>
-  <w:style w:type="table" w:styleId="104">
+  <w:style w:type="table" w:styleId="796">
     <w:name w:val="List Table 6 Colorful - Accent 1"/>
-    <w:basedOn w:val="11"/>
+    <w:basedOn w:val="703"/>
     <w:uiPriority w:val="99"/>
     <w:pPr>
       <w:pBdr/>
@@ -23879,9 +23804,9 @@
       </w:tcPr>
     </w:tblStylePr>
   </w:style>
-  <w:style w:type="table" w:styleId="105">
+  <w:style w:type="table" w:styleId="797">
     <w:name w:val="List Table 6 Colorful - Accent 2"/>
-    <w:basedOn w:val="11"/>
+    <w:basedOn w:val="703"/>
     <w:uiPriority w:val="99"/>
     <w:pPr>
       <w:pBdr/>
@@ -24102,9 +24027,9 @@
       </w:tcPr>
     </w:tblStylePr>
   </w:style>
-  <w:style w:type="table" w:styleId="106">
+  <w:style w:type="table" w:styleId="798">
     <w:name w:val="List Table 6 Colorful - Accent 3"/>
-    <w:basedOn w:val="11"/>
+    <w:basedOn w:val="703"/>
     <w:uiPriority w:val="99"/>
     <w:pPr>
       <w:pBdr/>
@@ -24325,9 +24250,9 @@
       </w:tcPr>
     </w:tblStylePr>
   </w:style>
-  <w:style w:type="table" w:styleId="107">
+  <w:style w:type="table" w:styleId="799">
     <w:name w:val="List Table 6 Colorful - Accent 4"/>
-    <w:basedOn w:val="11"/>
+    <w:basedOn w:val="703"/>
     <w:uiPriority w:val="99"/>
     <w:pPr>
       <w:pBdr/>
@@ -24548,9 +24473,9 @@
       </w:tcPr>
     </w:tblStylePr>
   </w:style>
-  <w:style w:type="table" w:styleId="108">
+  <w:style w:type="table" w:styleId="800">
     <w:name w:val="List Table 6 Colorful - Accent 5"/>
-    <w:basedOn w:val="11"/>
+    <w:basedOn w:val="703"/>
     <w:uiPriority w:val="99"/>
     <w:pPr>
       <w:pBdr/>
@@ -24771,9 +24696,9 @@
       </w:tcPr>
     </w:tblStylePr>
   </w:style>
-  <w:style w:type="table" w:styleId="109">
+  <w:style w:type="table" w:styleId="801">
     <w:name w:val="List Table 6 Colorful - Accent 6"/>
-    <w:basedOn w:val="11"/>
+    <w:basedOn w:val="703"/>
     <w:uiPriority w:val="99"/>
     <w:pPr>
       <w:pBdr/>
@@ -24994,9 +24919,9 @@
       </w:tcPr>
     </w:tblStylePr>
   </w:style>
-  <w:style w:type="table" w:styleId="110">
+  <w:style w:type="table" w:styleId="802">
     <w:name w:val="List Table 7 Colorful"/>
-    <w:basedOn w:val="11"/>
+    <w:basedOn w:val="703"/>
     <w:uiPriority w:val="99"/>
     <w:pPr>
       <w:pBdr/>
@@ -25095,11 +25020,11 @@
         <w:tblBorders/>
       </w:tblPr>
       <w:tcPr>
-        <w:shd w:color="ffffff"/>
+        <w:shd w:val="clear" w:color="ffffff"/>
         <w:tcBorders>
-          <w:top w:val="none"/>
-          <w:left w:val="none"/>
-          <w:bottom w:val="none"/>
+          <w:top w:val="none" w:color="000000" w:sz="4" w:space="0"/>
+          <w:left w:val="none" w:color="000000" w:sz="4" w:space="0"/>
+          <w:bottom w:val="none" w:color="000000" w:sz="4" w:space="0"/>
           <w:right w:val="single" w:color="000000" w:themeColor="text1" w:themeTint="80" w:sz="4" w:space="0"/>
         </w:tcBorders>
       </w:tcPr>
@@ -25122,10 +25047,10 @@
       <w:tcPr>
         <w:shd w:val="clear" w:color="ffffff" w:themeColor="light1" w:fill="ffffff" w:themeFill="light1"/>
         <w:tcBorders>
-          <w:top w:val="none"/>
-          <w:left w:val="none"/>
+          <w:top w:val="none" w:color="000000" w:sz="4" w:space="0"/>
+          <w:left w:val="none" w:color="000000" w:sz="4" w:space="0"/>
           <w:bottom w:val="single" w:color="000000" w:themeColor="text1" w:themeTint="80" w:sz="4" w:space="0"/>
-          <w:right w:val="none"/>
+          <w:right w:val="none" w:color="000000" w:sz="4" w:space="0"/>
         </w:tcBorders>
       </w:tcPr>
     </w:tblStylePr>
@@ -25145,12 +25070,12 @@
         <w:tblBorders/>
       </w:tblPr>
       <w:tcPr>
-        <w:shd w:color="ffffff"/>
+        <w:shd w:val="clear" w:color="ffffff"/>
         <w:tcBorders>
-          <w:top w:val="none"/>
+          <w:top w:val="none" w:color="000000" w:sz="4" w:space="0"/>
           <w:left w:val="single" w:color="000000" w:themeColor="text1" w:themeTint="80" w:sz="4" w:space="0"/>
-          <w:bottom w:val="none"/>
-          <w:right w:val="none"/>
+          <w:bottom w:val="none" w:color="000000" w:sz="4" w:space="0"/>
+          <w:right w:val="none" w:color="000000" w:sz="4" w:space="0"/>
         </w:tcBorders>
       </w:tcPr>
     </w:tblStylePr>
@@ -25173,9 +25098,9 @@
         <w:shd w:val="clear" w:color="ffffff" w:themeColor="light1" w:fill="ffffff" w:themeFill="light1"/>
         <w:tcBorders>
           <w:top w:val="single" w:color="000000" w:themeColor="text1" w:themeTint="80" w:sz="4" w:space="0"/>
-          <w:left w:val="none"/>
-          <w:bottom w:val="none"/>
-          <w:right w:val="none"/>
+          <w:left w:val="none" w:color="000000" w:sz="4" w:space="0"/>
+          <w:bottom w:val="none" w:color="000000" w:sz="4" w:space="0"/>
+          <w:right w:val="none" w:color="000000" w:sz="4" w:space="0"/>
         </w:tcBorders>
       </w:tcPr>
     </w:tblStylePr>
@@ -25250,9 +25175,9 @@
       </w:tcPr>
     </w:tblStylePr>
   </w:style>
-  <w:style w:type="table" w:styleId="111">
+  <w:style w:type="table" w:styleId="803">
     <w:name w:val="List Table 7 Colorful - Accent 1"/>
-    <w:basedOn w:val="11"/>
+    <w:basedOn w:val="703"/>
     <w:uiPriority w:val="99"/>
     <w:pPr>
       <w:pBdr/>
@@ -25351,11 +25276,11 @@
         <w:tblBorders/>
       </w:tblPr>
       <w:tcPr>
-        <w:shd w:color="ffffff"/>
+        <w:shd w:val="clear" w:color="ffffff"/>
         <w:tcBorders>
-          <w:top w:val="none"/>
-          <w:left w:val="none"/>
-          <w:bottom w:val="none"/>
+          <w:top w:val="none" w:color="000000" w:sz="4" w:space="0"/>
+          <w:left w:val="none" w:color="000000" w:sz="4" w:space="0"/>
+          <w:bottom w:val="none" w:color="000000" w:sz="4" w:space="0"/>
           <w:right w:val="single" w:color="000000" w:themeColor="accent1" w:sz="4" w:space="0"/>
         </w:tcBorders>
       </w:tcPr>
@@ -25378,10 +25303,10 @@
       <w:tcPr>
         <w:shd w:val="clear" w:color="ffffff" w:themeColor="light1" w:fill="ffffff" w:themeFill="light1"/>
         <w:tcBorders>
-          <w:top w:val="none"/>
-          <w:left w:val="none"/>
+          <w:top w:val="none" w:color="000000" w:sz="4" w:space="0"/>
+          <w:left w:val="none" w:color="000000" w:sz="4" w:space="0"/>
           <w:bottom w:val="single" w:color="000000" w:themeColor="accent1" w:sz="4" w:space="0"/>
-          <w:right w:val="none"/>
+          <w:right w:val="none" w:color="000000" w:sz="4" w:space="0"/>
         </w:tcBorders>
       </w:tcPr>
     </w:tblStylePr>
@@ -25401,12 +25326,12 @@
         <w:tblBorders/>
       </w:tblPr>
       <w:tcPr>
-        <w:shd w:color="ffffff"/>
+        <w:shd w:val="clear" w:color="ffffff"/>
         <w:tcBorders>
-          <w:top w:val="none"/>
+          <w:top w:val="none" w:color="000000" w:sz="4" w:space="0"/>
           <w:left w:val="single" w:color="000000" w:themeColor="accent1" w:sz="4" w:space="0"/>
-          <w:bottom w:val="none"/>
-          <w:right w:val="none"/>
+          <w:bottom w:val="none" w:color="000000" w:sz="4" w:space="0"/>
+          <w:right w:val="none" w:color="000000" w:sz="4" w:space="0"/>
         </w:tcBorders>
       </w:tcPr>
     </w:tblStylePr>
@@ -25429,9 +25354,9 @@
         <w:shd w:val="clear" w:color="ffffff" w:themeColor="light1" w:fill="ffffff" w:themeFill="light1"/>
         <w:tcBorders>
           <w:top w:val="single" w:color="000000" w:themeColor="accent1" w:sz="4" w:space="0"/>
-          <w:left w:val="none"/>
-          <w:bottom w:val="none"/>
-          <w:right w:val="none"/>
+          <w:left w:val="none" w:color="000000" w:sz="4" w:space="0"/>
+          <w:bottom w:val="none" w:color="000000" w:sz="4" w:space="0"/>
+          <w:right w:val="none" w:color="000000" w:sz="4" w:space="0"/>
         </w:tcBorders>
       </w:tcPr>
     </w:tblStylePr>
@@ -25506,9 +25431,9 @@
       </w:tcPr>
     </w:tblStylePr>
   </w:style>
-  <w:style w:type="table" w:styleId="112">
+  <w:style w:type="table" w:styleId="804">
     <w:name w:val="List Table 7 Colorful - Accent 2"/>
-    <w:basedOn w:val="11"/>
+    <w:basedOn w:val="703"/>
     <w:uiPriority w:val="99"/>
     <w:pPr>
       <w:pBdr/>
@@ -25607,11 +25532,11 @@
         <w:tblBorders/>
       </w:tblPr>
       <w:tcPr>
-        <w:shd w:color="ffffff"/>
+        <w:shd w:val="clear" w:color="ffffff"/>
         <w:tcBorders>
-          <w:top w:val="none"/>
-          <w:left w:val="none"/>
-          <w:bottom w:val="none"/>
+          <w:top w:val="none" w:color="000000" w:sz="4" w:space="0"/>
+          <w:left w:val="none" w:color="000000" w:sz="4" w:space="0"/>
+          <w:bottom w:val="none" w:color="000000" w:sz="4" w:space="0"/>
           <w:right w:val="single" w:color="000000" w:themeColor="accent2" w:themeTint="97" w:sz="4" w:space="0"/>
         </w:tcBorders>
       </w:tcPr>
@@ -25634,10 +25559,10 @@
       <w:tcPr>
         <w:shd w:val="clear" w:color="ffffff" w:themeColor="light1" w:fill="ffffff" w:themeFill="light1"/>
         <w:tcBorders>
-          <w:top w:val="none"/>
-          <w:left w:val="none"/>
+          <w:top w:val="none" w:color="000000" w:sz="4" w:space="0"/>
+          <w:left w:val="none" w:color="000000" w:sz="4" w:space="0"/>
           <w:bottom w:val="single" w:color="000000" w:themeColor="accent2" w:themeTint="97" w:sz="4" w:space="0"/>
-          <w:right w:val="none"/>
+          <w:right w:val="none" w:color="000000" w:sz="4" w:space="0"/>
         </w:tcBorders>
       </w:tcPr>
     </w:tblStylePr>
@@ -25657,12 +25582,12 @@
         <w:tblBorders/>
       </w:tblPr>
       <w:tcPr>
-        <w:shd w:color="ffffff"/>
+        <w:shd w:val="clear" w:color="ffffff"/>
         <w:tcBorders>
-          <w:top w:val="none"/>
+          <w:top w:val="none" w:color="000000" w:sz="4" w:space="0"/>
           <w:left w:val="single" w:color="000000" w:themeColor="accent2" w:themeTint="97" w:sz="4" w:space="0"/>
-          <w:bottom w:val="none"/>
-          <w:right w:val="none"/>
+          <w:bottom w:val="none" w:color="000000" w:sz="4" w:space="0"/>
+          <w:right w:val="none" w:color="000000" w:sz="4" w:space="0"/>
         </w:tcBorders>
       </w:tcPr>
     </w:tblStylePr>
@@ -25685,9 +25610,9 @@
         <w:shd w:val="clear" w:color="ffffff" w:themeColor="light1" w:fill="ffffff" w:themeFill="light1"/>
         <w:tcBorders>
           <w:top w:val="single" w:color="000000" w:themeColor="accent2" w:themeTint="97" w:sz="4" w:space="0"/>
-          <w:left w:val="none"/>
-          <w:bottom w:val="none"/>
-          <w:right w:val="none"/>
+          <w:left w:val="none" w:color="000000" w:sz="4" w:space="0"/>
+          <w:bottom w:val="none" w:color="000000" w:sz="4" w:space="0"/>
+          <w:right w:val="none" w:color="000000" w:sz="4" w:space="0"/>
         </w:tcBorders>
       </w:tcPr>
     </w:tblStylePr>
@@ -25762,9 +25687,9 @@
       </w:tcPr>
     </w:tblStylePr>
   </w:style>
-  <w:style w:type="table" w:styleId="113">
+  <w:style w:type="table" w:styleId="805">
     <w:name w:val="List Table 7 Colorful - Accent 3"/>
-    <w:basedOn w:val="11"/>
+    <w:basedOn w:val="703"/>
     <w:uiPriority w:val="99"/>
     <w:pPr>
       <w:pBdr/>
@@ -25863,11 +25788,11 @@
         <w:tblBorders/>
       </w:tblPr>
       <w:tcPr>
-        <w:shd w:color="ffffff"/>
+        <w:shd w:val="clear" w:color="ffffff"/>
         <w:tcBorders>
-          <w:top w:val="none"/>
-          <w:left w:val="none"/>
-          <w:bottom w:val="none"/>
+          <w:top w:val="none" w:color="000000" w:sz="4" w:space="0"/>
+          <w:left w:val="none" w:color="000000" w:sz="4" w:space="0"/>
+          <w:bottom w:val="none" w:color="000000" w:sz="4" w:space="0"/>
           <w:right w:val="single" w:color="000000" w:themeColor="accent3" w:themeTint="98" w:sz="4" w:space="0"/>
         </w:tcBorders>
       </w:tcPr>
@@ -25890,10 +25815,10 @@
       <w:tcPr>
         <w:shd w:val="clear" w:color="ffffff" w:themeColor="light1" w:fill="ffffff" w:themeFill="light1"/>
         <w:tcBorders>
-          <w:top w:val="none"/>
-          <w:left w:val="none"/>
+          <w:top w:val="none" w:color="000000" w:sz="4" w:space="0"/>
+          <w:left w:val="none" w:color="000000" w:sz="4" w:space="0"/>
           <w:bottom w:val="single" w:color="000000" w:themeColor="accent3" w:themeTint="98" w:sz="4" w:space="0"/>
-          <w:right w:val="none"/>
+          <w:right w:val="none" w:color="000000" w:sz="4" w:space="0"/>
         </w:tcBorders>
       </w:tcPr>
     </w:tblStylePr>
@@ -25913,12 +25838,12 @@
         <w:tblBorders/>
       </w:tblPr>
       <w:tcPr>
-        <w:shd w:color="ffffff"/>
+        <w:shd w:val="clear" w:color="ffffff"/>
         <w:tcBorders>
-          <w:top w:val="none"/>
+          <w:top w:val="none" w:color="000000" w:sz="4" w:space="0"/>
           <w:left w:val="single" w:color="000000" w:themeColor="accent3" w:themeTint="98" w:sz="4" w:space="0"/>
-          <w:bottom w:val="none"/>
-          <w:right w:val="none"/>
+          <w:bottom w:val="none" w:color="000000" w:sz="4" w:space="0"/>
+          <w:right w:val="none" w:color="000000" w:sz="4" w:space="0"/>
         </w:tcBorders>
       </w:tcPr>
     </w:tblStylePr>
@@ -25941,9 +25866,9 @@
         <w:shd w:val="clear" w:color="ffffff" w:themeColor="light1" w:fill="ffffff" w:themeFill="light1"/>
         <w:tcBorders>
           <w:top w:val="single" w:color="000000" w:themeColor="accent3" w:themeTint="98" w:sz="4" w:space="0"/>
-          <w:left w:val="none"/>
-          <w:bottom w:val="none"/>
-          <w:right w:val="none"/>
+          <w:left w:val="none" w:color="000000" w:sz="4" w:space="0"/>
+          <w:bottom w:val="none" w:color="000000" w:sz="4" w:space="0"/>
+          <w:right w:val="none" w:color="000000" w:sz="4" w:space="0"/>
         </w:tcBorders>
       </w:tcPr>
     </w:tblStylePr>
@@ -26018,9 +25943,9 @@
       </w:tcPr>
     </w:tblStylePr>
   </w:style>
-  <w:style w:type="table" w:styleId="114">
+  <w:style w:type="table" w:styleId="806">
     <w:name w:val="List Table 7 Colorful - Accent 4"/>
-    <w:basedOn w:val="11"/>
+    <w:basedOn w:val="703"/>
     <w:uiPriority w:val="99"/>
     <w:pPr>
       <w:pBdr/>
@@ -26119,11 +26044,11 @@
         <w:tblBorders/>
       </w:tblPr>
       <w:tcPr>
-        <w:shd w:color="ffffff"/>
+        <w:shd w:val="clear" w:color="ffffff"/>
         <w:tcBorders>
-          <w:top w:val="none"/>
-          <w:left w:val="none"/>
-          <w:bottom w:val="none"/>
+          <w:top w:val="none" w:color="000000" w:sz="4" w:space="0"/>
+          <w:left w:val="none" w:color="000000" w:sz="4" w:space="0"/>
+          <w:bottom w:val="none" w:color="000000" w:sz="4" w:space="0"/>
           <w:right w:val="single" w:color="000000" w:themeColor="accent4" w:themeTint="9A" w:sz="4" w:space="0"/>
         </w:tcBorders>
       </w:tcPr>
@@ -26146,10 +26071,10 @@
       <w:tcPr>
         <w:shd w:val="clear" w:color="ffffff" w:themeColor="light1" w:fill="ffffff" w:themeFill="light1"/>
         <w:tcBorders>
-          <w:top w:val="none"/>
-          <w:left w:val="none"/>
+          <w:top w:val="none" w:color="000000" w:sz="4" w:space="0"/>
+          <w:left w:val="none" w:color="000000" w:sz="4" w:space="0"/>
           <w:bottom w:val="single" w:color="000000" w:themeColor="accent4" w:themeTint="9A" w:sz="4" w:space="0"/>
-          <w:right w:val="none"/>
+          <w:right w:val="none" w:color="000000" w:sz="4" w:space="0"/>
         </w:tcBorders>
       </w:tcPr>
     </w:tblStylePr>
@@ -26169,12 +26094,12 @@
         <w:tblBorders/>
       </w:tblPr>
       <w:tcPr>
-        <w:shd w:color="ffffff"/>
+        <w:shd w:val="clear" w:color="ffffff"/>
         <w:tcBorders>
-          <w:top w:val="none"/>
+          <w:top w:val="none" w:color="000000" w:sz="4" w:space="0"/>
           <w:left w:val="single" w:color="000000" w:themeColor="accent4" w:themeTint="9A" w:sz="4" w:space="0"/>
-          <w:bottom w:val="none"/>
-          <w:right w:val="none"/>
+          <w:bottom w:val="none" w:color="000000" w:sz="4" w:space="0"/>
+          <w:right w:val="none" w:color="000000" w:sz="4" w:space="0"/>
         </w:tcBorders>
       </w:tcPr>
     </w:tblStylePr>
@@ -26197,9 +26122,9 @@
         <w:shd w:val="clear" w:color="ffffff" w:themeColor="light1" w:fill="ffffff" w:themeFill="light1"/>
         <w:tcBorders>
           <w:top w:val="single" w:color="000000" w:themeColor="accent4" w:themeTint="9A" w:sz="4" w:space="0"/>
-          <w:left w:val="none"/>
-          <w:bottom w:val="none"/>
-          <w:right w:val="none"/>
+          <w:left w:val="none" w:color="000000" w:sz="4" w:space="0"/>
+          <w:bottom w:val="none" w:color="000000" w:sz="4" w:space="0"/>
+          <w:right w:val="none" w:color="000000" w:sz="4" w:space="0"/>
         </w:tcBorders>
       </w:tcPr>
     </w:tblStylePr>
@@ -26274,9 +26199,9 @@
       </w:tcPr>
     </w:tblStylePr>
   </w:style>
-  <w:style w:type="table" w:styleId="115">
+  <w:style w:type="table" w:styleId="807">
     <w:name w:val="List Table 7 Colorful - Accent 5"/>
-    <w:basedOn w:val="11"/>
+    <w:basedOn w:val="703"/>
     <w:uiPriority w:val="99"/>
     <w:pPr>
       <w:pBdr/>
@@ -26375,11 +26300,11 @@
         <w:tblBorders/>
       </w:tblPr>
       <w:tcPr>
-        <w:shd w:color="ffffff"/>
+        <w:shd w:val="clear" w:color="ffffff"/>
         <w:tcBorders>
-          <w:top w:val="none"/>
-          <w:left w:val="none"/>
-          <w:bottom w:val="none"/>
+          <w:top w:val="none" w:color="000000" w:sz="4" w:space="0"/>
+          <w:left w:val="none" w:color="000000" w:sz="4" w:space="0"/>
+          <w:bottom w:val="none" w:color="000000" w:sz="4" w:space="0"/>
           <w:right w:val="single" w:color="000000" w:themeColor="accent5" w:themeTint="9A" w:sz="4" w:space="0"/>
         </w:tcBorders>
       </w:tcPr>
@@ -26402,10 +26327,10 @@
       <w:tcPr>
         <w:shd w:val="clear" w:color="ffffff" w:themeColor="light1" w:fill="ffffff" w:themeFill="light1"/>
         <w:tcBorders>
-          <w:top w:val="none"/>
-          <w:left w:val="none"/>
+          <w:top w:val="none" w:color="000000" w:sz="4" w:space="0"/>
+          <w:left w:val="none" w:color="000000" w:sz="4" w:space="0"/>
           <w:bottom w:val="single" w:color="000000" w:themeColor="accent5" w:themeTint="9A" w:sz="4" w:space="0"/>
-          <w:right w:val="none"/>
+          <w:right w:val="none" w:color="000000" w:sz="4" w:space="0"/>
         </w:tcBorders>
       </w:tcPr>
     </w:tblStylePr>
@@ -26425,12 +26350,12 @@
         <w:tblBorders/>
       </w:tblPr>
       <w:tcPr>
-        <w:shd w:color="ffffff"/>
+        <w:shd w:val="clear" w:color="ffffff"/>
         <w:tcBorders>
-          <w:top w:val="none"/>
+          <w:top w:val="none" w:color="000000" w:sz="4" w:space="0"/>
           <w:left w:val="single" w:color="000000" w:themeColor="accent5" w:themeTint="9A" w:sz="4" w:space="0"/>
-          <w:bottom w:val="none"/>
-          <w:right w:val="none"/>
+          <w:bottom w:val="none" w:color="000000" w:sz="4" w:space="0"/>
+          <w:right w:val="none" w:color="000000" w:sz="4" w:space="0"/>
         </w:tcBorders>
       </w:tcPr>
     </w:tblStylePr>
@@ -26453,9 +26378,9 @@
         <w:shd w:val="clear" w:color="ffffff" w:themeColor="light1" w:fill="ffffff" w:themeFill="light1"/>
         <w:tcBorders>
           <w:top w:val="single" w:color="000000" w:themeColor="accent5" w:themeTint="9A" w:sz="4" w:space="0"/>
-          <w:left w:val="none"/>
-          <w:bottom w:val="none"/>
-          <w:right w:val="none"/>
+          <w:left w:val="none" w:color="000000" w:sz="4" w:space="0"/>
+          <w:bottom w:val="none" w:color="000000" w:sz="4" w:space="0"/>
+          <w:right w:val="none" w:color="000000" w:sz="4" w:space="0"/>
         </w:tcBorders>
       </w:tcPr>
     </w:tblStylePr>
@@ -26530,9 +26455,9 @@
       </w:tcPr>
     </w:tblStylePr>
   </w:style>
-  <w:style w:type="table" w:styleId="116">
+  <w:style w:type="table" w:styleId="808">
     <w:name w:val="List Table 7 Colorful - Accent 6"/>
-    <w:basedOn w:val="11"/>
+    <w:basedOn w:val="703"/>
     <w:uiPriority w:val="99"/>
     <w:pPr>
       <w:pBdr/>
@@ -26631,11 +26556,11 @@
         <w:tblBorders/>
       </w:tblPr>
       <w:tcPr>
-        <w:shd w:color="ffffff"/>
+        <w:shd w:val="clear" w:color="ffffff"/>
         <w:tcBorders>
-          <w:top w:val="none"/>
-          <w:left w:val="none"/>
-          <w:bottom w:val="none"/>
+          <w:top w:val="none" w:color="000000" w:sz="4" w:space="0"/>
+          <w:left w:val="none" w:color="000000" w:sz="4" w:space="0"/>
+          <w:bottom w:val="none" w:color="000000" w:sz="4" w:space="0"/>
           <w:right w:val="single" w:color="000000" w:themeColor="accent6" w:themeTint="98" w:sz="4" w:space="0"/>
         </w:tcBorders>
       </w:tcPr>
@@ -26658,10 +26583,10 @@
       <w:tcPr>
         <w:shd w:val="clear" w:color="ffffff" w:themeColor="light1" w:fill="ffffff" w:themeFill="light1"/>
         <w:tcBorders>
-          <w:top w:val="none"/>
-          <w:left w:val="none"/>
+          <w:top w:val="none" w:color="000000" w:sz="4" w:space="0"/>
+          <w:left w:val="none" w:color="000000" w:sz="4" w:space="0"/>
           <w:bottom w:val="single" w:color="000000" w:themeColor="accent6" w:themeTint="98" w:sz="4" w:space="0"/>
-          <w:right w:val="none"/>
+          <w:right w:val="none" w:color="000000" w:sz="4" w:space="0"/>
         </w:tcBorders>
       </w:tcPr>
     </w:tblStylePr>
@@ -26681,12 +26606,12 @@
         <w:tblBorders/>
       </w:tblPr>
       <w:tcPr>
-        <w:shd w:color="ffffff"/>
+        <w:shd w:val="clear" w:color="ffffff"/>
         <w:tcBorders>
-          <w:top w:val="none"/>
+          <w:top w:val="none" w:color="000000" w:sz="4" w:space="0"/>
           <w:left w:val="single" w:color="000000" w:themeColor="accent6" w:themeTint="98" w:sz="4" w:space="0"/>
-          <w:bottom w:val="none"/>
-          <w:right w:val="none"/>
+          <w:bottom w:val="none" w:color="000000" w:sz="4" w:space="0"/>
+          <w:right w:val="none" w:color="000000" w:sz="4" w:space="0"/>
         </w:tcBorders>
       </w:tcPr>
     </w:tblStylePr>
@@ -26709,9 +26634,9 @@
         <w:shd w:val="clear" w:color="ffffff" w:themeColor="light1" w:fill="ffffff" w:themeFill="light1"/>
         <w:tcBorders>
           <w:top w:val="single" w:color="000000" w:themeColor="accent6" w:themeTint="98" w:sz="4" w:space="0"/>
-          <w:left w:val="none"/>
-          <w:bottom w:val="none"/>
-          <w:right w:val="none"/>
+          <w:left w:val="none" w:color="000000" w:sz="4" w:space="0"/>
+          <w:bottom w:val="none" w:color="000000" w:sz="4" w:space="0"/>
+          <w:right w:val="none" w:color="000000" w:sz="4" w:space="0"/>
         </w:tcBorders>
       </w:tcPr>
     </w:tblStylePr>
@@ -26786,9 +26711,9 @@
       </w:tcPr>
     </w:tblStylePr>
   </w:style>
-  <w:style w:type="table" w:styleId="117">
+  <w:style w:type="table" w:styleId="809">
     <w:name w:val="Lined - Accent"/>
-    <w:basedOn w:val="11"/>
+    <w:basedOn w:val="703"/>
     <w:uiPriority w:val="99"/>
     <w:pPr>
       <w:pBdr/>
@@ -27023,9 +26948,9 @@
       </w:tcPr>
     </w:tblStylePr>
   </w:style>
-  <w:style w:type="table" w:styleId="118">
+  <w:style w:type="table" w:styleId="810">
     <w:name w:val="Lined - Accent 1"/>
-    <w:basedOn w:val="11"/>
+    <w:basedOn w:val="703"/>
     <w:uiPriority w:val="99"/>
     <w:pPr>
       <w:pBdr/>
@@ -27260,9 +27185,9 @@
       </w:tcPr>
     </w:tblStylePr>
   </w:style>
-  <w:style w:type="table" w:styleId="119">
+  <w:style w:type="table" w:styleId="811">
     <w:name w:val="Lined - Accent 2"/>
-    <w:basedOn w:val="11"/>
+    <w:basedOn w:val="703"/>
     <w:uiPriority w:val="99"/>
     <w:pPr>
       <w:pBdr/>
@@ -27497,9 +27422,9 @@
       </w:tcPr>
     </w:tblStylePr>
   </w:style>
-  <w:style w:type="table" w:styleId="120">
+  <w:style w:type="table" w:styleId="812">
     <w:name w:val="Lined - Accent 3"/>
-    <w:basedOn w:val="11"/>
+    <w:basedOn w:val="703"/>
     <w:uiPriority w:val="99"/>
     <w:pPr>
       <w:pBdr/>
@@ -27734,9 +27659,9 @@
       </w:tcPr>
     </w:tblStylePr>
   </w:style>
-  <w:style w:type="table" w:styleId="121">
+  <w:style w:type="table" w:styleId="813">
     <w:name w:val="Lined - Accent 4"/>
-    <w:basedOn w:val="11"/>
+    <w:basedOn w:val="703"/>
     <w:uiPriority w:val="99"/>
     <w:pPr>
       <w:pBdr/>
@@ -27971,9 +27896,9 @@
       </w:tcPr>
     </w:tblStylePr>
   </w:style>
-  <w:style w:type="table" w:styleId="122">
+  <w:style w:type="table" w:styleId="814">
     <w:name w:val="Lined - Accent 5"/>
-    <w:basedOn w:val="11"/>
+    <w:basedOn w:val="703"/>
     <w:uiPriority w:val="99"/>
     <w:pPr>
       <w:pBdr/>
@@ -28208,9 +28133,9 @@
       </w:tcPr>
     </w:tblStylePr>
   </w:style>
-  <w:style w:type="table" w:styleId="123">
+  <w:style w:type="table" w:styleId="815">
     <w:name w:val="Lined - Accent 6"/>
-    <w:basedOn w:val="11"/>
+    <w:basedOn w:val="703"/>
     <w:uiPriority w:val="99"/>
     <w:pPr>
       <w:pBdr/>
@@ -28445,9 +28370,9 @@
       </w:tcPr>
     </w:tblStylePr>
   </w:style>
-  <w:style w:type="table" w:styleId="124">
+  <w:style w:type="table" w:styleId="816">
     <w:name w:val="Bordered &amp; Lined - Accent"/>
-    <w:basedOn w:val="11"/>
+    <w:basedOn w:val="703"/>
     <w:uiPriority w:val="99"/>
     <w:pPr>
       <w:pBdr/>
@@ -28689,9 +28614,9 @@
       </w:tcPr>
     </w:tblStylePr>
   </w:style>
-  <w:style w:type="table" w:styleId="125">
+  <w:style w:type="table" w:styleId="817">
     <w:name w:val="Bordered &amp; Lined - Accent 1"/>
-    <w:basedOn w:val="11"/>
+    <w:basedOn w:val="703"/>
     <w:uiPriority w:val="99"/>
     <w:pPr>
       <w:pBdr/>
@@ -28933,9 +28858,9 @@
       </w:tcPr>
     </w:tblStylePr>
   </w:style>
-  <w:style w:type="table" w:styleId="126">
+  <w:style w:type="table" w:styleId="818">
     <w:name w:val="Bordered &amp; Lined - Accent 2"/>
-    <w:basedOn w:val="11"/>
+    <w:basedOn w:val="703"/>
     <w:uiPriority w:val="99"/>
     <w:pPr>
       <w:pBdr/>
@@ -29177,9 +29102,9 @@
       </w:tcPr>
     </w:tblStylePr>
   </w:style>
-  <w:style w:type="table" w:styleId="127">
+  <w:style w:type="table" w:styleId="819">
     <w:name w:val="Bordered &amp; Lined - Accent 3"/>
-    <w:basedOn w:val="11"/>
+    <w:basedOn w:val="703"/>
     <w:uiPriority w:val="99"/>
     <w:pPr>
       <w:pBdr/>
@@ -29421,9 +29346,9 @@
       </w:tcPr>
     </w:tblStylePr>
   </w:style>
-  <w:style w:type="table" w:styleId="128">
+  <w:style w:type="table" w:styleId="820">
     <w:name w:val="Bordered &amp; Lined - Accent 4"/>
-    <w:basedOn w:val="11"/>
+    <w:basedOn w:val="703"/>
     <w:uiPriority w:val="99"/>
     <w:pPr>
       <w:pBdr/>
@@ -29665,9 +29590,9 @@
       </w:tcPr>
     </w:tblStylePr>
   </w:style>
-  <w:style w:type="table" w:styleId="129">
+  <w:style w:type="table" w:styleId="821">
     <w:name w:val="Bordered &amp; Lined - Accent 5"/>
-    <w:basedOn w:val="11"/>
+    <w:basedOn w:val="703"/>
     <w:uiPriority w:val="99"/>
     <w:pPr>
       <w:pBdr/>
@@ -29909,9 +29834,9 @@
       </w:tcPr>
     </w:tblStylePr>
   </w:style>
-  <w:style w:type="table" w:styleId="130">
+  <w:style w:type="table" w:styleId="822">
     <w:name w:val="Bordered &amp; Lined - Accent 6"/>
-    <w:basedOn w:val="11"/>
+    <w:basedOn w:val="703"/>
     <w:uiPriority w:val="99"/>
     <w:pPr>
       <w:pBdr/>
@@ -30153,9 +30078,9 @@
       </w:tcPr>
     </w:tblStylePr>
   </w:style>
-  <w:style w:type="table" w:styleId="131">
+  <w:style w:type="table" w:styleId="823">
     <w:name w:val="Bordered"/>
-    <w:basedOn w:val="11"/>
+    <w:basedOn w:val="703"/>
     <w:uiPriority w:val="99"/>
     <w:pPr>
       <w:pBdr/>
@@ -30384,9 +30309,9 @@
       </w:tcPr>
     </w:tblStylePr>
   </w:style>
-  <w:style w:type="table" w:styleId="132">
+  <w:style w:type="table" w:styleId="824">
     <w:name w:val="Bordered - Accent 1"/>
-    <w:basedOn w:val="11"/>
+    <w:basedOn w:val="703"/>
     <w:uiPriority w:val="99"/>
     <w:pPr>
       <w:pBdr/>
@@ -30615,9 +30540,9 @@
       </w:tcPr>
     </w:tblStylePr>
   </w:style>
-  <w:style w:type="table" w:styleId="133">
+  <w:style w:type="table" w:styleId="825">
     <w:name w:val="Bordered - Accent 2"/>
-    <w:basedOn w:val="11"/>
+    <w:basedOn w:val="703"/>
     <w:uiPriority w:val="99"/>
     <w:pPr>
       <w:pBdr/>
@@ -30846,9 +30771,9 @@
       </w:tcPr>
     </w:tblStylePr>
   </w:style>
-  <w:style w:type="table" w:styleId="134">
+  <w:style w:type="table" w:styleId="826">
     <w:name w:val="Bordered - Accent 3"/>
-    <w:basedOn w:val="11"/>
+    <w:basedOn w:val="703"/>
     <w:uiPriority w:val="99"/>
     <w:pPr>
       <w:pBdr/>
@@ -31077,9 +31002,9 @@
       </w:tcPr>
     </w:tblStylePr>
   </w:style>
-  <w:style w:type="table" w:styleId="135">
+  <w:style w:type="table" w:styleId="827">
     <w:name w:val="Bordered - Accent 4"/>
-    <w:basedOn w:val="11"/>
+    <w:basedOn w:val="703"/>
     <w:uiPriority w:val="99"/>
     <w:pPr>
       <w:pBdr/>
@@ -31308,9 +31233,9 @@
       </w:tcPr>
     </w:tblStylePr>
   </w:style>
-  <w:style w:type="table" w:styleId="136">
+  <w:style w:type="table" w:styleId="828">
     <w:name w:val="Bordered - Accent 5"/>
-    <w:basedOn w:val="11"/>
+    <w:basedOn w:val="703"/>
     <w:uiPriority w:val="99"/>
     <w:pPr>
       <w:pBdr/>
@@ -31539,9 +31464,9 @@
       </w:tcPr>
     </w:tblStylePr>
   </w:style>
-  <w:style w:type="table" w:styleId="137">
+  <w:style w:type="table" w:styleId="829">
     <w:name w:val="Bordered - Accent 6"/>
-    <w:basedOn w:val="11"/>
+    <w:basedOn w:val="703"/>
     <w:uiPriority w:val="99"/>
     <w:pPr>
       <w:pBdr/>
@@ -31770,7 +31695,7 @@
       </w:tcPr>
     </w:tblStylePr>
   </w:style>
-  <w:style w:type="paragraph" w:styleId="138" w:default="1">
+  <w:style w:type="paragraph" w:styleId="830" w:default="1">
     <w:name w:val="Normal"/>
     <w:qFormat/>
     <w:pPr>
@@ -31779,11 +31704,11 @@
       <w:ind/>
     </w:pPr>
   </w:style>
-  <w:style w:type="paragraph" w:styleId="145">
+  <w:style w:type="paragraph" w:styleId="831">
     <w:name w:val="Heading 7"/>
-    <w:basedOn w:val="138"/>
-    <w:next w:val="138"/>
-    <w:link w:val="156"/>
+    <w:basedOn w:val="830"/>
+    <w:next w:val="830"/>
+    <w:link w:val="842"/>
     <w:uiPriority w:val="9"/>
     <w:unhideWhenUsed/>
     <w:qFormat/>
@@ -31800,11 +31725,11 @@
       <w:color w:val="595959" w:themeColor="text1" w:themeTint="A6"/>
     </w:rPr>
   </w:style>
-  <w:style w:type="paragraph" w:styleId="146">
+  <w:style w:type="paragraph" w:styleId="832">
     <w:name w:val="Heading 8"/>
-    <w:basedOn w:val="138"/>
-    <w:next w:val="138"/>
-    <w:link w:val="157"/>
+    <w:basedOn w:val="830"/>
+    <w:next w:val="830"/>
+    <w:link w:val="843"/>
     <w:uiPriority w:val="9"/>
     <w:unhideWhenUsed/>
     <w:qFormat/>
@@ -31823,11 +31748,11 @@
       <w:color w:val="272727" w:themeColor="text1" w:themeTint="D8"/>
     </w:rPr>
   </w:style>
-  <w:style w:type="paragraph" w:styleId="147">
+  <w:style w:type="paragraph" w:styleId="833">
     <w:name w:val="Heading 9"/>
-    <w:basedOn w:val="138"/>
-    <w:next w:val="138"/>
-    <w:link w:val="158"/>
+    <w:basedOn w:val="830"/>
+    <w:next w:val="830"/>
+    <w:link w:val="844"/>
     <w:uiPriority w:val="9"/>
     <w:unhideWhenUsed/>
     <w:qFormat/>
@@ -31846,7 +31771,7 @@
       <w:color w:val="272727" w:themeColor="text1" w:themeTint="D8"/>
     </w:rPr>
   </w:style>
-  <w:style w:type="character" w:styleId="148" w:default="1">
+  <w:style w:type="character" w:styleId="834" w:default="1">
     <w:name w:val="Default Paragraph Font"/>
     <w:uiPriority w:val="1"/>
     <w:semiHidden/>
@@ -31857,7 +31782,7 @@
       <w:ind/>
     </w:pPr>
   </w:style>
-  <w:style w:type="numbering" w:styleId="149" w:default="1">
+  <w:style w:type="numbering" w:styleId="835" w:default="1">
     <w:name w:val="No List"/>
     <w:uiPriority w:val="99"/>
     <w:semiHidden/>
@@ -31868,10 +31793,10 @@
       <w:ind/>
     </w:pPr>
   </w:style>
-  <w:style w:type="character" w:styleId="150">
+  <w:style w:type="character" w:styleId="836">
     <w:name w:val="Heading 1 Char"/>
-    <w:basedOn w:val="148"/>
-    <w:link w:val="706"/>
+    <w:basedOn w:val="834"/>
+    <w:link w:val="878"/>
     <w:uiPriority w:val="9"/>
     <w:pPr>
       <w:pBdr/>
@@ -31885,10 +31810,10 @@
       <w:szCs w:val="40"/>
     </w:rPr>
   </w:style>
-  <w:style w:type="character" w:styleId="151">
+  <w:style w:type="character" w:styleId="837">
     <w:name w:val="Heading 2 Char"/>
-    <w:basedOn w:val="148"/>
-    <w:link w:val="707"/>
+    <w:basedOn w:val="834"/>
+    <w:link w:val="879"/>
     <w:uiPriority w:val="9"/>
     <w:pPr>
       <w:pBdr/>
@@ -31902,10 +31827,10 @@
       <w:szCs w:val="32"/>
     </w:rPr>
   </w:style>
-  <w:style w:type="character" w:styleId="152">
+  <w:style w:type="character" w:styleId="838">
     <w:name w:val="Heading 3 Char"/>
-    <w:basedOn w:val="148"/>
-    <w:link w:val="708"/>
+    <w:basedOn w:val="834"/>
+    <w:link w:val="880"/>
     <w:uiPriority w:val="9"/>
     <w:pPr>
       <w:pBdr/>
@@ -31919,10 +31844,10 @@
       <w:szCs w:val="28"/>
     </w:rPr>
   </w:style>
-  <w:style w:type="character" w:styleId="153">
+  <w:style w:type="character" w:styleId="839">
     <w:name w:val="Heading 4 Char"/>
-    <w:basedOn w:val="148"/>
-    <w:link w:val="709"/>
+    <w:basedOn w:val="834"/>
+    <w:link w:val="881"/>
     <w:uiPriority w:val="9"/>
     <w:pPr>
       <w:pBdr/>
@@ -31936,10 +31861,10 @@
       <w:color w:val="0f4761" w:themeColor="accent1" w:themeShade="BF"/>
     </w:rPr>
   </w:style>
-  <w:style w:type="character" w:styleId="154">
+  <w:style w:type="character" w:styleId="840">
     <w:name w:val="Heading 5 Char"/>
-    <w:basedOn w:val="148"/>
-    <w:link w:val="710"/>
+    <w:basedOn w:val="834"/>
+    <w:link w:val="882"/>
     <w:uiPriority w:val="9"/>
     <w:pPr>
       <w:pBdr/>
@@ -31951,10 +31876,10 @@
       <w:color w:val="0f4761" w:themeColor="accent1" w:themeShade="BF"/>
     </w:rPr>
   </w:style>
-  <w:style w:type="character" w:styleId="155">
+  <w:style w:type="character" w:styleId="841">
     <w:name w:val="Heading 6 Char"/>
-    <w:basedOn w:val="148"/>
-    <w:link w:val="711"/>
+    <w:basedOn w:val="834"/>
+    <w:link w:val="883"/>
     <w:uiPriority w:val="9"/>
     <w:pPr>
       <w:pBdr/>
@@ -31968,10 +31893,10 @@
       <w:color w:val="595959" w:themeColor="text1" w:themeTint="A6"/>
     </w:rPr>
   </w:style>
-  <w:style w:type="character" w:styleId="156">
+  <w:style w:type="character" w:styleId="842">
     <w:name w:val="Heading 7 Char"/>
-    <w:basedOn w:val="148"/>
-    <w:link w:val="145"/>
+    <w:basedOn w:val="834"/>
+    <w:link w:val="831"/>
     <w:uiPriority w:val="9"/>
     <w:pPr>
       <w:pBdr/>
@@ -31983,10 +31908,10 @@
       <w:color w:val="595959" w:themeColor="text1" w:themeTint="A6"/>
     </w:rPr>
   </w:style>
-  <w:style w:type="character" w:styleId="157">
+  <w:style w:type="character" w:styleId="843">
     <w:name w:val="Heading 8 Char"/>
-    <w:basedOn w:val="148"/>
-    <w:link w:val="146"/>
+    <w:basedOn w:val="834"/>
+    <w:link w:val="832"/>
     <w:uiPriority w:val="9"/>
     <w:pPr>
       <w:pBdr/>
@@ -32000,10 +31925,10 @@
       <w:color w:val="272727" w:themeColor="text1" w:themeTint="D8"/>
     </w:rPr>
   </w:style>
-  <w:style w:type="character" w:styleId="158">
+  <w:style w:type="character" w:styleId="844">
     <w:name w:val="Heading 9 Char"/>
-    <w:basedOn w:val="148"/>
-    <w:link w:val="147"/>
+    <w:basedOn w:val="834"/>
+    <w:link w:val="833"/>
     <w:uiPriority w:val="9"/>
     <w:pPr>
       <w:pBdr/>
@@ -32017,10 +31942,10 @@
       <w:color w:val="272727" w:themeColor="text1" w:themeTint="D8"/>
     </w:rPr>
   </w:style>
-  <w:style w:type="character" w:styleId="160">
+  <w:style w:type="character" w:styleId="845">
     <w:name w:val="Title Char"/>
-    <w:basedOn w:val="148"/>
-    <w:link w:val="705"/>
+    <w:basedOn w:val="834"/>
+    <w:link w:val="877"/>
     <w:uiPriority w:val="10"/>
     <w:pPr>
       <w:pBdr/>
@@ -32034,11 +31959,11 @@
       <w:szCs w:val="56"/>
     </w:rPr>
   </w:style>
-  <w:style w:type="paragraph" w:styleId="161">
+  <w:style w:type="paragraph" w:styleId="846">
     <w:name w:val="Subtitle"/>
-    <w:basedOn w:val="138"/>
-    <w:next w:val="138"/>
-    <w:link w:val="162"/>
+    <w:basedOn w:val="830"/>
+    <w:next w:val="830"/>
+    <w:link w:val="847"/>
     <w:uiPriority w:val="11"/>
     <w:qFormat/>
     <w:pPr>
@@ -32056,10 +31981,10 @@
       <w:szCs w:val="28"/>
     </w:rPr>
   </w:style>
-  <w:style w:type="character" w:styleId="162">
+  <w:style w:type="character" w:styleId="847">
     <w:name w:val="Subtitle Char"/>
-    <w:basedOn w:val="148"/>
-    <w:link w:val="161"/>
+    <w:basedOn w:val="834"/>
+    <w:link w:val="846"/>
     <w:uiPriority w:val="11"/>
     <w:pPr>
       <w:pBdr/>
@@ -32073,11 +31998,11 @@
       <w:szCs w:val="28"/>
     </w:rPr>
   </w:style>
-  <w:style w:type="paragraph" w:styleId="163">
+  <w:style w:type="paragraph" w:styleId="848">
     <w:name w:val="Quote"/>
-    <w:basedOn w:val="138"/>
-    <w:next w:val="138"/>
-    <w:link w:val="164"/>
+    <w:basedOn w:val="830"/>
+    <w:next w:val="830"/>
+    <w:link w:val="849"/>
     <w:uiPriority w:val="29"/>
     <w:qFormat/>
     <w:pPr>
@@ -32092,10 +32017,10 @@
       <w:color w:val="404040" w:themeColor="text1" w:themeTint="BF"/>
     </w:rPr>
   </w:style>
-  <w:style w:type="character" w:styleId="164">
+  <w:style w:type="character" w:styleId="849">
     <w:name w:val="Quote Char"/>
-    <w:basedOn w:val="148"/>
-    <w:link w:val="163"/>
+    <w:basedOn w:val="834"/>
+    <w:link w:val="848"/>
     <w:uiPriority w:val="29"/>
     <w:pPr>
       <w:pBdr/>
@@ -32108,9 +32033,9 @@
       <w:color w:val="404040" w:themeColor="text1" w:themeTint="BF"/>
     </w:rPr>
   </w:style>
-  <w:style w:type="character" w:styleId="166">
+  <w:style w:type="character" w:styleId="850">
     <w:name w:val="Intense Emphasis"/>
-    <w:basedOn w:val="148"/>
+    <w:basedOn w:val="834"/>
     <w:uiPriority w:val="21"/>
     <w:qFormat/>
     <w:pPr>
@@ -32124,11 +32049,11 @@
       <w:color w:val="0f4761" w:themeColor="accent1" w:themeShade="BF"/>
     </w:rPr>
   </w:style>
-  <w:style w:type="paragraph" w:styleId="167">
+  <w:style w:type="paragraph" w:styleId="851">
     <w:name w:val="Intense Quote"/>
-    <w:basedOn w:val="138"/>
-    <w:next w:val="138"/>
-    <w:link w:val="168"/>
+    <w:basedOn w:val="830"/>
+    <w:next w:val="830"/>
+    <w:link w:val="852"/>
     <w:uiPriority w:val="30"/>
     <w:qFormat/>
     <w:pPr>
@@ -32146,10 +32071,10 @@
       <w:color w:val="0f4761" w:themeColor="accent1" w:themeShade="BF"/>
     </w:rPr>
   </w:style>
-  <w:style w:type="character" w:styleId="168">
+  <w:style w:type="character" w:styleId="852">
     <w:name w:val="Intense Quote Char"/>
-    <w:basedOn w:val="148"/>
-    <w:link w:val="167"/>
+    <w:basedOn w:val="834"/>
+    <w:link w:val="851"/>
     <w:uiPriority w:val="30"/>
     <w:pPr>
       <w:pBdr/>
@@ -32162,9 +32087,9 @@
       <w:color w:val="0f4761" w:themeColor="accent1" w:themeShade="BF"/>
     </w:rPr>
   </w:style>
-  <w:style w:type="character" w:styleId="169">
+  <w:style w:type="character" w:styleId="853">
     <w:name w:val="Intense Reference"/>
-    <w:basedOn w:val="148"/>
+    <w:basedOn w:val="834"/>
     <w:uiPriority w:val="32"/>
     <w:qFormat/>
     <w:pPr>
@@ -32180,9 +32105,9 @@
       <w:spacing w:val="5"/>
     </w:rPr>
   </w:style>
-  <w:style w:type="paragraph" w:styleId="170">
+  <w:style w:type="paragraph" w:styleId="854">
     <w:name w:val="No Spacing"/>
-    <w:basedOn w:val="138"/>
+    <w:basedOn w:val="830"/>
     <w:uiPriority w:val="1"/>
     <w:qFormat/>
     <w:pPr>
@@ -32191,9 +32116,9 @@
       <w:ind/>
     </w:pPr>
   </w:style>
-  <w:style w:type="character" w:styleId="171">
+  <w:style w:type="character" w:styleId="855">
     <w:name w:val="Subtle Emphasis"/>
-    <w:basedOn w:val="148"/>
+    <w:basedOn w:val="834"/>
     <w:uiPriority w:val="19"/>
     <w:qFormat/>
     <w:pPr>
@@ -32207,9 +32132,9 @@
       <w:color w:val="404040" w:themeColor="text1" w:themeTint="BF"/>
     </w:rPr>
   </w:style>
-  <w:style w:type="character" w:styleId="172">
+  <w:style w:type="character" w:styleId="856">
     <w:name w:val="Emphasis"/>
-    <w:basedOn w:val="148"/>
+    <w:basedOn w:val="834"/>
     <w:uiPriority w:val="20"/>
     <w:qFormat/>
     <w:pPr>
@@ -32222,9 +32147,9 @@
       <w:iCs/>
     </w:rPr>
   </w:style>
-  <w:style w:type="character" w:styleId="174">
+  <w:style w:type="character" w:styleId="857">
     <w:name w:val="Subtle Reference"/>
-    <w:basedOn w:val="148"/>
+    <w:basedOn w:val="834"/>
     <w:uiPriority w:val="31"/>
     <w:qFormat/>
     <w:pPr>
@@ -32237,9 +32162,9 @@
       <w:color w:val="5a5a5a" w:themeColor="text1" w:themeTint="A5"/>
     </w:rPr>
   </w:style>
-  <w:style w:type="character" w:styleId="175">
+  <w:style w:type="character" w:styleId="858">
     <w:name w:val="Book Title"/>
-    <w:basedOn w:val="148"/>
+    <w:basedOn w:val="834"/>
     <w:uiPriority w:val="33"/>
     <w:qFormat/>
     <w:pPr>
@@ -32255,10 +32180,10 @@
       <w:spacing w:val="5"/>
     </w:rPr>
   </w:style>
-  <w:style w:type="paragraph" w:styleId="176">
+  <w:style w:type="paragraph" w:styleId="859">
     <w:name w:val="Header"/>
-    <w:basedOn w:val="138"/>
-    <w:link w:val="177"/>
+    <w:basedOn w:val="830"/>
+    <w:link w:val="860"/>
     <w:uiPriority w:val="99"/>
     <w:unhideWhenUsed/>
     <w:pPr>
@@ -32271,10 +32196,10 @@
       <w:ind/>
     </w:pPr>
   </w:style>
-  <w:style w:type="character" w:styleId="177">
+  <w:style w:type="character" w:styleId="860">
     <w:name w:val="Header Char"/>
-    <w:basedOn w:val="148"/>
-    <w:link w:val="176"/>
+    <w:basedOn w:val="834"/>
+    <w:link w:val="859"/>
     <w:uiPriority w:val="99"/>
     <w:pPr>
       <w:pBdr/>
@@ -32282,10 +32207,10 @@
       <w:ind/>
     </w:pPr>
   </w:style>
-  <w:style w:type="paragraph" w:styleId="178">
+  <w:style w:type="paragraph" w:styleId="861">
     <w:name w:val="Footer"/>
-    <w:basedOn w:val="138"/>
-    <w:link w:val="179"/>
+    <w:basedOn w:val="830"/>
+    <w:link w:val="862"/>
     <w:uiPriority w:val="99"/>
     <w:unhideWhenUsed/>
     <w:pPr>
@@ -32298,10 +32223,10 @@
       <w:ind/>
     </w:pPr>
   </w:style>
-  <w:style w:type="character" w:styleId="179">
+  <w:style w:type="character" w:styleId="862">
     <w:name w:val="Footer Char"/>
-    <w:basedOn w:val="148"/>
-    <w:link w:val="178"/>
+    <w:basedOn w:val="834"/>
+    <w:link w:val="861"/>
     <w:uiPriority w:val="99"/>
     <w:pPr>
       <w:pBdr/>
@@ -32309,10 +32234,10 @@
       <w:ind/>
     </w:pPr>
   </w:style>
-  <w:style w:type="paragraph" w:styleId="180">
+  <w:style w:type="paragraph" w:styleId="863">
     <w:name w:val="Caption"/>
-    <w:basedOn w:val="138"/>
-    <w:next w:val="138"/>
+    <w:basedOn w:val="830"/>
+    <w:next w:val="830"/>
     <w:uiPriority w:val="35"/>
     <w:unhideWhenUsed/>
     <w:qFormat/>
@@ -32329,9 +32254,9 @@
       <w:szCs w:val="18"/>
     </w:rPr>
   </w:style>
-  <w:style w:type="character" w:styleId="188">
+  <w:style w:type="character" w:styleId="864">
     <w:name w:val="FollowedHyperlink"/>
-    <w:basedOn w:val="148"/>
+    <w:basedOn w:val="834"/>
     <w:uiPriority w:val="99"/>
     <w:semiHidden/>
     <w:unhideWhenUsed/>
@@ -32345,10 +32270,10 @@
       <w:u w:val="single"/>
     </w:rPr>
   </w:style>
-  <w:style w:type="paragraph" w:styleId="189">
+  <w:style w:type="paragraph" w:styleId="865">
     <w:name w:val="toc 1"/>
-    <w:basedOn w:val="138"/>
-    <w:next w:val="138"/>
+    <w:basedOn w:val="830"/>
+    <w:next w:val="830"/>
     <w:uiPriority w:val="39"/>
     <w:unhideWhenUsed/>
     <w:pPr>
@@ -32357,10 +32282,10 @@
       <w:ind/>
     </w:pPr>
   </w:style>
-  <w:style w:type="paragraph" w:styleId="190">
+  <w:style w:type="paragraph" w:styleId="866">
     <w:name w:val="toc 2"/>
-    <w:basedOn w:val="138"/>
-    <w:next w:val="138"/>
+    <w:basedOn w:val="830"/>
+    <w:next w:val="830"/>
     <w:uiPriority w:val="39"/>
     <w:unhideWhenUsed/>
     <w:pPr>
@@ -32369,10 +32294,10 @@
       <w:ind w:left="220"/>
     </w:pPr>
   </w:style>
-  <w:style w:type="paragraph" w:styleId="191">
+  <w:style w:type="paragraph" w:styleId="867">
     <w:name w:val="toc 3"/>
-    <w:basedOn w:val="138"/>
-    <w:next w:val="138"/>
+    <w:basedOn w:val="830"/>
+    <w:next w:val="830"/>
     <w:uiPriority w:val="39"/>
     <w:unhideWhenUsed/>
     <w:pPr>
@@ -32381,10 +32306,10 @@
       <w:ind w:left="440"/>
     </w:pPr>
   </w:style>
-  <w:style w:type="paragraph" w:styleId="192">
+  <w:style w:type="paragraph" w:styleId="868">
     <w:name w:val="toc 4"/>
-    <w:basedOn w:val="138"/>
-    <w:next w:val="138"/>
+    <w:basedOn w:val="830"/>
+    <w:next w:val="830"/>
     <w:uiPriority w:val="39"/>
     <w:unhideWhenUsed/>
     <w:pPr>
@@ -32393,10 +32318,10 @@
       <w:ind w:left="660"/>
     </w:pPr>
   </w:style>
-  <w:style w:type="paragraph" w:styleId="193">
+  <w:style w:type="paragraph" w:styleId="869">
     <w:name w:val="toc 5"/>
-    <w:basedOn w:val="138"/>
-    <w:next w:val="138"/>
+    <w:basedOn w:val="830"/>
+    <w:next w:val="830"/>
     <w:uiPriority w:val="39"/>
     <w:unhideWhenUsed/>
     <w:pPr>
@@ -32405,10 +32330,10 @@
       <w:ind w:left="880"/>
     </w:pPr>
   </w:style>
-  <w:style w:type="paragraph" w:styleId="194">
+  <w:style w:type="paragraph" w:styleId="870">
     <w:name w:val="toc 6"/>
-    <w:basedOn w:val="138"/>
-    <w:next w:val="138"/>
+    <w:basedOn w:val="830"/>
+    <w:next w:val="830"/>
     <w:uiPriority w:val="39"/>
     <w:unhideWhenUsed/>
     <w:pPr>
@@ -32417,10 +32342,10 @@
       <w:ind w:left="1100"/>
     </w:pPr>
   </w:style>
-  <w:style w:type="paragraph" w:styleId="195">
+  <w:style w:type="paragraph" w:styleId="871">
     <w:name w:val="toc 7"/>
-    <w:basedOn w:val="138"/>
-    <w:next w:val="138"/>
+    <w:basedOn w:val="830"/>
+    <w:next w:val="830"/>
     <w:uiPriority w:val="39"/>
     <w:unhideWhenUsed/>
     <w:pPr>
@@ -32429,10 +32354,10 @@
       <w:ind w:left="1320"/>
     </w:pPr>
   </w:style>
-  <w:style w:type="paragraph" w:styleId="196">
+  <w:style w:type="paragraph" w:styleId="872">
     <w:name w:val="toc 8"/>
-    <w:basedOn w:val="138"/>
-    <w:next w:val="138"/>
+    <w:basedOn w:val="830"/>
+    <w:next w:val="830"/>
     <w:uiPriority w:val="39"/>
     <w:unhideWhenUsed/>
     <w:pPr>
@@ -32441,10 +32366,10 @@
       <w:ind w:left="1540"/>
     </w:pPr>
   </w:style>
-  <w:style w:type="paragraph" w:styleId="197">
+  <w:style w:type="paragraph" w:styleId="873">
     <w:name w:val="toc 9"/>
-    <w:basedOn w:val="138"/>
-    <w:next w:val="138"/>
+    <w:basedOn w:val="830"/>
+    <w:next w:val="830"/>
     <w:uiPriority w:val="39"/>
     <w:unhideWhenUsed/>
     <w:pPr>
@@ -32453,9 +32378,9 @@
       <w:ind w:left="1760"/>
     </w:pPr>
   </w:style>
-  <w:style w:type="character" w:styleId="198">
+  <w:style w:type="character" w:styleId="874">
     <w:name w:val="Placeholder Text"/>
-    <w:basedOn w:val="148"/>
+    <w:basedOn w:val="834"/>
     <w:uiPriority w:val="99"/>
     <w:semiHidden/>
     <w:pPr>
@@ -32467,7 +32392,7 @@
       <w:color w:val="666666"/>
     </w:rPr>
   </w:style>
-  <w:style w:type="paragraph" w:styleId="208">
+  <w:style w:type="paragraph" w:styleId="875">
     <w:name w:val="TOC Heading"/>
     <w:uiPriority w:val="39"/>
     <w:unhideWhenUsed/>
@@ -32477,10 +32402,10 @@
       <w:ind/>
     </w:pPr>
   </w:style>
-  <w:style w:type="paragraph" w:styleId="209">
+  <w:style w:type="paragraph" w:styleId="876">
     <w:name w:val="table of figures"/>
-    <w:basedOn w:val="138"/>
-    <w:next w:val="138"/>
+    <w:basedOn w:val="830"/>
+    <w:next w:val="830"/>
     <w:uiPriority w:val="99"/>
     <w:unhideWhenUsed/>
     <w:pPr>
@@ -32489,7 +32414,7 @@
       <w:ind/>
     </w:pPr>
   </w:style>
-  <w:style w:type="paragraph" w:styleId="705">
+  <w:style w:type="paragraph" w:styleId="877">
     <w:name w:val="Title"/>
     <w:qFormat/>
     <w:pPr>
@@ -32502,7 +32427,7 @@
       <w:szCs w:val="56"/>
     </w:rPr>
   </w:style>
-  <w:style w:type="paragraph" w:styleId="706">
+  <w:style w:type="paragraph" w:styleId="878">
     <w:name w:val="Heading 1"/>
     <w:qFormat/>
     <w:pPr>
@@ -32516,7 +32441,7 @@
       <w:szCs w:val="32"/>
     </w:rPr>
   </w:style>
-  <w:style w:type="paragraph" w:styleId="707">
+  <w:style w:type="paragraph" w:styleId="879">
     <w:name w:val="Heading 2"/>
     <w:qFormat/>
     <w:pPr>
@@ -32530,7 +32455,7 @@
       <w:szCs w:val="26"/>
     </w:rPr>
   </w:style>
-  <w:style w:type="paragraph" w:styleId="708">
+  <w:style w:type="paragraph" w:styleId="880">
     <w:name w:val="Heading 3"/>
     <w:qFormat/>
     <w:pPr>
@@ -32544,7 +32469,7 @@
       <w:szCs w:val="24"/>
     </w:rPr>
   </w:style>
-  <w:style w:type="paragraph" w:styleId="709">
+  <w:style w:type="paragraph" w:styleId="881">
     <w:name w:val="Heading 4"/>
     <w:qFormat/>
     <w:pPr>
@@ -32558,7 +32483,7 @@
       <w:color w:val="2e74b5"/>
     </w:rPr>
   </w:style>
-  <w:style w:type="paragraph" w:styleId="710">
+  <w:style w:type="paragraph" w:styleId="882">
     <w:name w:val="Heading 5"/>
     <w:qFormat/>
     <w:pPr>
@@ -32570,7 +32495,7 @@
       <w:color w:val="2e74b5"/>
     </w:rPr>
   </w:style>
-  <w:style w:type="paragraph" w:styleId="711">
+  <w:style w:type="paragraph" w:styleId="883">
     <w:name w:val="Heading 6"/>
     <w:qFormat/>
     <w:pPr>
@@ -32582,7 +32507,7 @@
       <w:color w:val="1f4d78"/>
     </w:rPr>
   </w:style>
-  <w:style w:type="paragraph" w:styleId="712">
+  <w:style w:type="paragraph" w:styleId="884">
     <w:name w:val="Strong"/>
     <w:qFormat/>
     <w:pPr>
@@ -32595,7 +32520,7 @@
       <w:bCs/>
     </w:rPr>
   </w:style>
-  <w:style w:type="paragraph" w:styleId="713">
+  <w:style w:type="paragraph" w:styleId="885">
     <w:name w:val="List Paragraph"/>
     <w:qFormat/>
     <w:pPr>
@@ -32604,7 +32529,7 @@
       <w:ind/>
     </w:pPr>
   </w:style>
-  <w:style w:type="character" w:styleId="714">
+  <w:style w:type="character" w:styleId="886">
     <w:name w:val="Hyperlink"/>
     <w:uiPriority w:val="99"/>
     <w:unhideWhenUsed/>
@@ -32618,7 +32543,7 @@
       <w:u w:val="single"/>
     </w:rPr>
   </w:style>
-  <w:style w:type="character" w:styleId="715">
+  <w:style w:type="character" w:styleId="887">
     <w:name w:val="footnote reference"/>
     <w:uiPriority w:val="99"/>
     <w:semiHidden/>
@@ -32632,9 +32557,9 @@
       <w:vertAlign w:val="superscript"/>
     </w:rPr>
   </w:style>
-  <w:style w:type="paragraph" w:styleId="716">
+  <w:style w:type="paragraph" w:styleId="888">
     <w:name w:val="footnote text"/>
-    <w:link w:val="717"/>
+    <w:link w:val="889"/>
     <w:uiPriority w:val="99"/>
     <w:semiHidden/>
     <w:unhideWhenUsed/>
@@ -32648,9 +32573,9 @@
       <w:szCs w:val="20"/>
     </w:rPr>
   </w:style>
-  <w:style w:type="character" w:styleId="717">
+  <w:style w:type="character" w:styleId="889">
     <w:name w:val="Footnote Text Char"/>
-    <w:link w:val="716"/>
+    <w:link w:val="888"/>
     <w:uiPriority w:val="99"/>
     <w:semiHidden/>
     <w:unhideWhenUsed/>
@@ -32664,7 +32589,7 @@
       <w:szCs w:val="20"/>
     </w:rPr>
   </w:style>
-  <w:style w:type="character" w:styleId="718">
+  <w:style w:type="character" w:styleId="890">
     <w:name w:val="endnote reference"/>
     <w:uiPriority w:val="99"/>
     <w:semiHidden/>
@@ -32678,9 +32603,9 @@
       <w:vertAlign w:val="superscript"/>
     </w:rPr>
   </w:style>
-  <w:style w:type="paragraph" w:styleId="719">
+  <w:style w:type="paragraph" w:styleId="891">
     <w:name w:val="endnote text"/>
-    <w:link w:val="720"/>
+    <w:link w:val="892"/>
     <w:uiPriority w:val="99"/>
     <w:semiHidden/>
     <w:unhideWhenUsed/>
@@ -32694,9 +32619,9 @@
       <w:szCs w:val="20"/>
     </w:rPr>
   </w:style>
-  <w:style w:type="character" w:styleId="720">
+  <w:style w:type="character" w:styleId="892">
     <w:name w:val="Endnote Text Char"/>
-    <w:link w:val="719"/>
+    <w:link w:val="891"/>
     <w:uiPriority w:val="99"/>
     <w:semiHidden/>
     <w:unhideWhenUsed/>

</xml_diff>